<commit_message>
feat: unify dict-driven governance and refresh design assets
</commit_message>
<xml_diff>
--- a/documents/系统详细设计文档.docx
+++ b/documents/系统详细设计文档.docx
@@ -9,7 +9,7 @@
       </w:pPr>
       <w:r>
         <w:rPr>
-          <w:rFonts w:ascii="Calibri" w:hAnsi="Calibri" w:eastAsia="微软雅黑"/>
+          <w:rFonts w:ascii="微软雅黑" w:hAnsi="微软雅黑" w:eastAsia="微软雅黑"/>
           <w:b/>
           <w:sz w:val="36"/>
         </w:rPr>
@@ -23,7 +23,7 @@
       </w:pPr>
       <w:r>
         <w:rPr>
-          <w:rFonts w:ascii="Calibri" w:hAnsi="Calibri" w:eastAsia="微软雅黑"/>
+          <w:rFonts w:ascii="微软雅黑" w:hAnsi="微软雅黑" w:eastAsia="微软雅黑"/>
           <w:b w:val="0"/>
           <w:sz w:val="28"/>
         </w:rPr>
@@ -38,7 +38,7 @@
       </w:pPr>
       <w:r>
         <w:rPr>
-          <w:rFonts w:ascii="Calibri" w:hAnsi="Calibri" w:eastAsia="微软雅黑"/>
+          <w:rFonts w:ascii="微软雅黑" w:hAnsi="微软雅黑" w:eastAsia="微软雅黑"/>
           <w:b/>
           <w:sz w:val="32"/>
         </w:rPr>
@@ -51,7 +51,7 @@
       </w:pPr>
       <w:r>
         <w:rPr>
-          <w:rFonts w:ascii="Calibri" w:hAnsi="Calibri" w:eastAsia="微软雅黑"/>
+          <w:rFonts w:ascii="微软雅黑" w:hAnsi="微软雅黑" w:eastAsia="微软雅黑"/>
           <w:b w:val="0"/>
           <w:sz w:val="24"/>
         </w:rPr>
@@ -65,7 +65,7 @@
       </w:pPr>
       <w:r>
         <w:rPr>
-          <w:rFonts w:ascii="Calibri" w:hAnsi="Calibri" w:eastAsia="微软雅黑"/>
+          <w:rFonts w:ascii="微软雅黑" w:hAnsi="微软雅黑" w:eastAsia="微软雅黑"/>
           <w:b/>
           <w:sz w:val="32"/>
         </w:rPr>
@@ -79,11 +79,11 @@
       </w:pPr>
       <w:r>
         <w:rPr>
-          <w:rFonts w:ascii="Calibri" w:hAnsi="Calibri" w:eastAsia="微软雅黑"/>
+          <w:rFonts w:ascii="微软雅黑" w:hAnsi="微软雅黑" w:eastAsia="微软雅黑"/>
           <w:b w:val="0"/>
           <w:sz w:val="24"/>
         </w:rPr>
-        <w:t>Ontology: 以“博士生”为核心本体，统一学生、导师、计划、培养、学位、成果与审计实体。</w:t>
+        <w:t>Ontology: 以“博士生”为核心本体，统一学生、导师、团队、计划、培养、学位、成果、字典与审计实体。</w:t>
       </w:r>
     </w:p>
     <w:p>
@@ -93,7 +93,7 @@
       </w:pPr>
       <w:r>
         <w:rPr>
-          <w:rFonts w:ascii="Calibri" w:hAnsi="Calibri" w:eastAsia="微软雅黑"/>
+          <w:rFonts w:ascii="微软雅黑" w:hAnsi="微软雅黑" w:eastAsia="微软雅黑"/>
           <w:b w:val="0"/>
           <w:sz w:val="24"/>
         </w:rPr>
@@ -107,11 +107,25 @@
       </w:pPr>
       <w:r>
         <w:rPr>
-          <w:rFonts w:ascii="Calibri" w:hAnsi="Calibri" w:eastAsia="微软雅黑"/>
+          <w:rFonts w:ascii="微软雅黑" w:hAnsi="微软雅黑" w:eastAsia="微软雅黑"/>
           <w:b w:val="0"/>
           <w:sz w:val="24"/>
         </w:rPr>
         <w:t>Palantir 风格数据建模: 强调统一语义、单一事实来源、过程可追踪和跨系统联动。</w:t>
+      </w:r>
+    </w:p>
+    <w:p>
+      <w:pPr>
+        <w:pStyle w:val="ListBullet"/>
+        <w:spacing w:line="288" w:lineRule="auto"/>
+      </w:pPr>
+      <w:r>
+        <w:rPr>
+          <w:rFonts w:ascii="微软雅黑" w:hAnsi="微软雅黑" w:eastAsia="微软雅黑"/>
+          <w:b w:val="0"/>
+          <w:sz w:val="24"/>
+        </w:rPr>
+        <w:t>数据库治理原则: PostgreSQL 作为唯一运行数据源，页面选项、状态色和对象关系必须与数据库同步演进。</w:t>
       </w:r>
     </w:p>
     <w:p>
@@ -121,7 +135,7 @@
       </w:pPr>
       <w:r>
         <w:rPr>
-          <w:rFonts w:ascii="Calibri" w:hAnsi="Calibri" w:eastAsia="微软雅黑"/>
+          <w:rFonts w:ascii="微软雅黑" w:hAnsi="微软雅黑" w:eastAsia="微软雅黑"/>
           <w:b/>
           <w:sz w:val="32"/>
         </w:rPr>
@@ -135,7 +149,7 @@
       </w:pPr>
       <w:r>
         <w:rPr>
-          <w:rFonts w:ascii="Calibri" w:hAnsi="Calibri" w:eastAsia="微软雅黑"/>
+          <w:rFonts w:ascii="微软雅黑" w:hAnsi="微软雅黑" w:eastAsia="微软雅黑"/>
           <w:b/>
           <w:sz w:val="24"/>
         </w:rPr>
@@ -163,7 +177,7 @@
             </w:pPr>
             <w:r>
               <w:rPr>
-                <w:rFonts w:ascii="Calibri" w:hAnsi="Calibri" w:eastAsia="微软雅黑"/>
+                <w:rFonts w:ascii="微软雅黑" w:hAnsi="微软雅黑" w:eastAsia="微软雅黑"/>
                 <w:b w:val="0"/>
                 <w:sz w:val="20"/>
               </w:rPr>
@@ -181,7 +195,7 @@
             </w:pPr>
             <w:r>
               <w:rPr>
-                <w:rFonts w:ascii="Calibri" w:hAnsi="Calibri" w:eastAsia="微软雅黑"/>
+                <w:rFonts w:ascii="微软雅黑" w:hAnsi="微软雅黑" w:eastAsia="微软雅黑"/>
                 <w:b w:val="0"/>
                 <w:sz w:val="20"/>
               </w:rPr>
@@ -201,7 +215,7 @@
             </w:pPr>
             <w:r>
               <w:rPr>
-                <w:rFonts w:ascii="Calibri" w:hAnsi="Calibri" w:eastAsia="微软雅黑"/>
+                <w:rFonts w:ascii="微软雅黑" w:hAnsi="微软雅黑" w:eastAsia="微软雅黑"/>
                 <w:b w:val="0"/>
                 <w:sz w:val="20"/>
               </w:rPr>
@@ -219,7 +233,7 @@
             </w:pPr>
             <w:r>
               <w:rPr>
-                <w:rFonts w:ascii="Calibri" w:hAnsi="Calibri" w:eastAsia="微软雅黑"/>
+                <w:rFonts w:ascii="微软雅黑" w:hAnsi="微软雅黑" w:eastAsia="微软雅黑"/>
                 <w:b w:val="0"/>
                 <w:sz w:val="20"/>
               </w:rPr>
@@ -239,7 +253,7 @@
             </w:pPr>
             <w:r>
               <w:rPr>
-                <w:rFonts w:ascii="Calibri" w:hAnsi="Calibri" w:eastAsia="微软雅黑"/>
+                <w:rFonts w:ascii="微软雅黑" w:hAnsi="微软雅黑" w:eastAsia="微软雅黑"/>
                 <w:b w:val="0"/>
                 <w:sz w:val="20"/>
               </w:rPr>
@@ -257,7 +271,7 @@
             </w:pPr>
             <w:r>
               <w:rPr>
-                <w:rFonts w:ascii="Calibri" w:hAnsi="Calibri" w:eastAsia="微软雅黑"/>
+                <w:rFonts w:ascii="微软雅黑" w:hAnsi="微软雅黑" w:eastAsia="微软雅黑"/>
                 <w:b w:val="0"/>
                 <w:sz w:val="20"/>
               </w:rPr>
@@ -277,7 +291,7 @@
             </w:pPr>
             <w:r>
               <w:rPr>
-                <w:rFonts w:ascii="Calibri" w:hAnsi="Calibri" w:eastAsia="微软雅黑"/>
+                <w:rFonts w:ascii="微软雅黑" w:hAnsi="微软雅黑" w:eastAsia="微软雅黑"/>
                 <w:b w:val="0"/>
                 <w:sz w:val="20"/>
               </w:rPr>
@@ -295,7 +309,7 @@
             </w:pPr>
             <w:r>
               <w:rPr>
-                <w:rFonts w:ascii="Calibri" w:hAnsi="Calibri" w:eastAsia="微软雅黑"/>
+                <w:rFonts w:ascii="微软雅黑" w:hAnsi="微软雅黑" w:eastAsia="微软雅黑"/>
                 <w:b w:val="0"/>
                 <w:sz w:val="20"/>
               </w:rPr>
@@ -315,7 +329,7 @@
             </w:pPr>
             <w:r>
               <w:rPr>
-                <w:rFonts w:ascii="Calibri" w:hAnsi="Calibri" w:eastAsia="微软雅黑"/>
+                <w:rFonts w:ascii="微软雅黑" w:hAnsi="微软雅黑" w:eastAsia="微软雅黑"/>
                 <w:b w:val="0"/>
                 <w:sz w:val="20"/>
               </w:rPr>
@@ -333,7 +347,7 @@
             </w:pPr>
             <w:r>
               <w:rPr>
-                <w:rFonts w:ascii="Calibri" w:hAnsi="Calibri" w:eastAsia="微软雅黑"/>
+                <w:rFonts w:ascii="微软雅黑" w:hAnsi="微软雅黑" w:eastAsia="微软雅黑"/>
                 <w:b w:val="0"/>
                 <w:sz w:val="20"/>
               </w:rPr>
@@ -353,7 +367,7 @@
             </w:pPr>
             <w:r>
               <w:rPr>
-                <w:rFonts w:ascii="Calibri" w:hAnsi="Calibri" w:eastAsia="微软雅黑"/>
+                <w:rFonts w:ascii="微软雅黑" w:hAnsi="微软雅黑" w:eastAsia="微软雅黑"/>
                 <w:b w:val="0"/>
                 <w:sz w:val="20"/>
               </w:rPr>
@@ -371,7 +385,7 @@
             </w:pPr>
             <w:r>
               <w:rPr>
-                <w:rFonts w:ascii="Calibri" w:hAnsi="Calibri" w:eastAsia="微软雅黑"/>
+                <w:rFonts w:ascii="微软雅黑" w:hAnsi="微软雅黑" w:eastAsia="微软雅黑"/>
                 <w:b w:val="0"/>
                 <w:sz w:val="20"/>
               </w:rPr>
@@ -391,7 +405,7 @@
             </w:pPr>
             <w:r>
               <w:rPr>
-                <w:rFonts w:ascii="Calibri" w:hAnsi="Calibri" w:eastAsia="微软雅黑"/>
+                <w:rFonts w:ascii="微软雅黑" w:hAnsi="微软雅黑" w:eastAsia="微软雅黑"/>
                 <w:b w:val="0"/>
                 <w:sz w:val="20"/>
               </w:rPr>
@@ -409,7 +423,7 @@
             </w:pPr>
             <w:r>
               <w:rPr>
-                <w:rFonts w:ascii="Calibri" w:hAnsi="Calibri" w:eastAsia="微软雅黑"/>
+                <w:rFonts w:ascii="微软雅黑" w:hAnsi="微软雅黑" w:eastAsia="微软雅黑"/>
                 <w:b w:val="0"/>
                 <w:sz w:val="20"/>
               </w:rPr>
@@ -429,7 +443,7 @@
             </w:pPr>
             <w:r>
               <w:rPr>
-                <w:rFonts w:ascii="Calibri" w:hAnsi="Calibri" w:eastAsia="微软雅黑"/>
+                <w:rFonts w:ascii="微软雅黑" w:hAnsi="微软雅黑" w:eastAsia="微软雅黑"/>
                 <w:b w:val="0"/>
                 <w:sz w:val="20"/>
               </w:rPr>
@@ -447,7 +461,7 @@
             </w:pPr>
             <w:r>
               <w:rPr>
-                <w:rFonts w:ascii="Calibri" w:hAnsi="Calibri" w:eastAsia="微软雅黑"/>
+                <w:rFonts w:ascii="微软雅黑" w:hAnsi="微软雅黑" w:eastAsia="微软雅黑"/>
                 <w:b w:val="0"/>
                 <w:sz w:val="20"/>
               </w:rPr>
@@ -467,7 +481,7 @@
             </w:pPr>
             <w:r>
               <w:rPr>
-                <w:rFonts w:ascii="Calibri" w:hAnsi="Calibri" w:eastAsia="微软雅黑"/>
+                <w:rFonts w:ascii="微软雅黑" w:hAnsi="微软雅黑" w:eastAsia="微软雅黑"/>
                 <w:b w:val="0"/>
                 <w:sz w:val="20"/>
               </w:rPr>
@@ -485,7 +499,7 @@
             </w:pPr>
             <w:r>
               <w:rPr>
-                <w:rFonts w:ascii="Calibri" w:hAnsi="Calibri" w:eastAsia="微软雅黑"/>
+                <w:rFonts w:ascii="微软雅黑" w:hAnsi="微软雅黑" w:eastAsia="微软雅黑"/>
                 <w:b w:val="0"/>
                 <w:sz w:val="20"/>
               </w:rPr>
@@ -502,7 +516,7 @@
       </w:pPr>
       <w:r>
         <w:rPr>
-          <w:rFonts w:ascii="Calibri" w:hAnsi="Calibri" w:eastAsia="微软雅黑"/>
+          <w:rFonts w:ascii="微软雅黑" w:hAnsi="微软雅黑" w:eastAsia="微软雅黑"/>
           <w:b/>
           <w:sz w:val="32"/>
         </w:rPr>
@@ -515,11 +529,11 @@
       </w:pPr>
       <w:r>
         <w:rPr>
-          <w:rFonts w:ascii="Calibri" w:hAnsi="Calibri" w:eastAsia="微软雅黑"/>
+          <w:rFonts w:ascii="微软雅黑" w:hAnsi="微软雅黑" w:eastAsia="微软雅黑"/>
           <w:b w:val="0"/>
           <w:sz w:val="24"/>
         </w:rPr>
-        <w:t>系统采用前后端分离模式。前端使用 Vue3 + Element Plus 构建管理门户，后端使用 Python3 FastAPI 输出 API 与业务服务，数据库使用 PostgreSQL，缓存与异步任务依赖 Redis Sentinel，统一通过 RBAC 与 JWT 管理访问控制。</w:t>
+        <w:t>系统采用前后端分离模式。前端使用 Vue3 + Element Plus 构建管理门户，后端使用 Python3 FastAPI 输出 API 与业务服务，数据库使用 PostgreSQL，缓存与异步任务依赖 Redis Sentinel，统一通过 RBAC 与 JWT 管理访问控制，并通过字典治理保证全站状态与选项来源一致。</w:t>
       </w:r>
     </w:p>
     <w:p>
@@ -565,7 +579,7 @@
       </w:pPr>
       <w:r>
         <w:rPr>
-          <w:rFonts w:ascii="Calibri" w:hAnsi="Calibri" w:eastAsia="微软雅黑"/>
+          <w:rFonts w:ascii="微软雅黑" w:hAnsi="微软雅黑" w:eastAsia="微软雅黑"/>
           <w:b w:val="0"/>
           <w:sz w:val="20"/>
         </w:rPr>
@@ -579,7 +593,7 @@
       </w:pPr>
       <w:r>
         <w:rPr>
-          <w:rFonts w:ascii="Calibri" w:hAnsi="Calibri" w:eastAsia="微软雅黑"/>
+          <w:rFonts w:ascii="微软雅黑" w:hAnsi="微软雅黑" w:eastAsia="微软雅黑"/>
           <w:b/>
           <w:sz w:val="28"/>
         </w:rPr>
@@ -593,7 +607,7 @@
       </w:pPr>
       <w:r>
         <w:rPr>
-          <w:rFonts w:ascii="Calibri" w:hAnsi="Calibri" w:eastAsia="微软雅黑"/>
+          <w:rFonts w:ascii="微软雅黑" w:hAnsi="微软雅黑" w:eastAsia="微软雅黑"/>
           <w:b/>
           <w:sz w:val="24"/>
         </w:rPr>
@@ -621,7 +635,7 @@
             </w:pPr>
             <w:r>
               <w:rPr>
-                <w:rFonts w:ascii="Calibri" w:hAnsi="Calibri" w:eastAsia="微软雅黑"/>
+                <w:rFonts w:ascii="微软雅黑" w:hAnsi="微软雅黑" w:eastAsia="微软雅黑"/>
                 <w:b w:val="0"/>
                 <w:sz w:val="20"/>
               </w:rPr>
@@ -639,7 +653,7 @@
             </w:pPr>
             <w:r>
               <w:rPr>
-                <w:rFonts w:ascii="Calibri" w:hAnsi="Calibri" w:eastAsia="微软雅黑"/>
+                <w:rFonts w:ascii="微软雅黑" w:hAnsi="微软雅黑" w:eastAsia="微软雅黑"/>
                 <w:b w:val="0"/>
                 <w:sz w:val="20"/>
               </w:rPr>
@@ -659,7 +673,7 @@
             </w:pPr>
             <w:r>
               <w:rPr>
-                <w:rFonts w:ascii="Calibri" w:hAnsi="Calibri" w:eastAsia="微软雅黑"/>
+                <w:rFonts w:ascii="微软雅黑" w:hAnsi="微软雅黑" w:eastAsia="微软雅黑"/>
                 <w:b w:val="0"/>
                 <w:sz w:val="20"/>
               </w:rPr>
@@ -677,11 +691,11 @@
             </w:pPr>
             <w:r>
               <w:rPr>
-                <w:rFonts w:ascii="Calibri" w:hAnsi="Calibri" w:eastAsia="微软雅黑"/>
+                <w:rFonts w:ascii="微软雅黑" w:hAnsi="微软雅黑" w:eastAsia="微软雅黑"/>
                 <w:b w:val="0"/>
                 <w:sz w:val="20"/>
               </w:rPr>
-              <w:t>建立学生唯一主档案，沉淀招生、培养、学位与就业全周期信息。</w:t>
+              <w:t>建立学生唯一主档案，并通过导师、团队、状态等受控主数据沉淀全周期信息。</w:t>
             </w:r>
           </w:p>
         </w:tc>
@@ -697,7 +711,7 @@
             </w:pPr>
             <w:r>
               <w:rPr>
-                <w:rFonts w:ascii="Calibri" w:hAnsi="Calibri" w:eastAsia="微软雅黑"/>
+                <w:rFonts w:ascii="微软雅黑" w:hAnsi="微软雅黑" w:eastAsia="微软雅黑"/>
                 <w:b w:val="0"/>
                 <w:sz w:val="20"/>
               </w:rPr>
@@ -715,7 +729,7 @@
             </w:pPr>
             <w:r>
               <w:rPr>
-                <w:rFonts w:ascii="Calibri" w:hAnsi="Calibri" w:eastAsia="微软雅黑"/>
+                <w:rFonts w:ascii="微软雅黑" w:hAnsi="微软雅黑" w:eastAsia="微软雅黑"/>
                 <w:b w:val="0"/>
                 <w:sz w:val="20"/>
               </w:rPr>
@@ -735,7 +749,7 @@
             </w:pPr>
             <w:r>
               <w:rPr>
-                <w:rFonts w:ascii="Calibri" w:hAnsi="Calibri" w:eastAsia="微软雅黑"/>
+                <w:rFonts w:ascii="微软雅黑" w:hAnsi="微软雅黑" w:eastAsia="微软雅黑"/>
                 <w:b w:val="0"/>
                 <w:sz w:val="20"/>
               </w:rPr>
@@ -753,7 +767,7 @@
             </w:pPr>
             <w:r>
               <w:rPr>
-                <w:rFonts w:ascii="Calibri" w:hAnsi="Calibri" w:eastAsia="微软雅黑"/>
+                <w:rFonts w:ascii="微软雅黑" w:hAnsi="微软雅黑" w:eastAsia="微软雅黑"/>
                 <w:b w:val="0"/>
                 <w:sz w:val="20"/>
               </w:rPr>
@@ -773,7 +787,45 @@
             </w:pPr>
             <w:r>
               <w:rPr>
-                <w:rFonts w:ascii="Calibri" w:hAnsi="Calibri" w:eastAsia="微软雅黑"/>
+                <w:rFonts w:ascii="微软雅黑" w:hAnsi="微软雅黑" w:eastAsia="微软雅黑"/>
+                <w:b w:val="0"/>
+                <w:sz w:val="20"/>
+              </w:rPr>
+              <w:t>团队主数据管理</w:t>
+            </w:r>
+          </w:p>
+        </w:tc>
+        <w:tc>
+          <w:tcPr>
+            <w:tcW w:type="dxa" w:w="4680"/>
+          </w:tcPr>
+          <w:p>
+            <w:pPr>
+              <w:spacing w:line="288" w:lineRule="auto"/>
+            </w:pPr>
+            <w:r>
+              <w:rPr>
+                <w:rFonts w:ascii="微软雅黑" w:hAnsi="微软雅黑" w:eastAsia="微软雅黑"/>
+                <w:b w:val="0"/>
+                <w:sz w:val="20"/>
+              </w:rPr>
+              <w:t>围绕团队编码、负责人导师、团队导师集合、研究方向和学生归属统计进行治理。</w:t>
+            </w:r>
+          </w:p>
+        </w:tc>
+      </w:tr>
+      <w:tr>
+        <w:tc>
+          <w:tcPr>
+            <w:tcW w:type="dxa" w:w="4680"/>
+          </w:tcPr>
+          <w:p>
+            <w:pPr>
+              <w:spacing w:line="288" w:lineRule="auto"/>
+            </w:pPr>
+            <w:r>
+              <w:rPr>
+                <w:rFonts w:ascii="微软雅黑" w:hAnsi="微软雅黑" w:eastAsia="微软雅黑"/>
                 <w:b w:val="0"/>
                 <w:sz w:val="20"/>
               </w:rPr>
@@ -791,11 +843,11 @@
             </w:pPr>
             <w:r>
               <w:rPr>
-                <w:rFonts w:ascii="Calibri" w:hAnsi="Calibri" w:eastAsia="微软雅黑"/>
+                <w:rFonts w:ascii="微软雅黑" w:hAnsi="微软雅黑" w:eastAsia="微软雅黑"/>
                 <w:b w:val="0"/>
                 <w:sz w:val="20"/>
               </w:rPr>
-              <w:t>实现培养方案、科研报告、师生互评与成果沉淀。</w:t>
+              <w:t>实现培养方案、科研报告、外出研修的查询筛选、字典选择、批量处理与成果沉淀。</w:t>
             </w:r>
           </w:p>
         </w:tc>
@@ -811,7 +863,7 @@
             </w:pPr>
             <w:r>
               <w:rPr>
-                <w:rFonts w:ascii="Calibri" w:hAnsi="Calibri" w:eastAsia="微软雅黑"/>
+                <w:rFonts w:ascii="微软雅黑" w:hAnsi="微软雅黑" w:eastAsia="微软雅黑"/>
                 <w:b w:val="0"/>
                 <w:sz w:val="20"/>
               </w:rPr>
@@ -829,7 +881,7 @@
             </w:pPr>
             <w:r>
               <w:rPr>
-                <w:rFonts w:ascii="Calibri" w:hAnsi="Calibri" w:eastAsia="微软雅黑"/>
+                <w:rFonts w:ascii="微软雅黑" w:hAnsi="微软雅黑" w:eastAsia="微软雅黑"/>
                 <w:b w:val="0"/>
                 <w:sz w:val="20"/>
               </w:rPr>
@@ -849,7 +901,7 @@
             </w:pPr>
             <w:r>
               <w:rPr>
-                <w:rFonts w:ascii="Calibri" w:hAnsi="Calibri" w:eastAsia="微软雅黑"/>
+                <w:rFonts w:ascii="微软雅黑" w:hAnsi="微软雅黑" w:eastAsia="微软雅黑"/>
                 <w:b w:val="0"/>
                 <w:sz w:val="20"/>
               </w:rPr>
@@ -867,7 +919,7 @@
             </w:pPr>
             <w:r>
               <w:rPr>
-                <w:rFonts w:ascii="Calibri" w:hAnsi="Calibri" w:eastAsia="微软雅黑"/>
+                <w:rFonts w:ascii="微软雅黑" w:hAnsi="微软雅黑" w:eastAsia="微软雅黑"/>
                 <w:b w:val="0"/>
                 <w:sz w:val="20"/>
               </w:rPr>
@@ -887,7 +939,7 @@
             </w:pPr>
             <w:r>
               <w:rPr>
-                <w:rFonts w:ascii="Calibri" w:hAnsi="Calibri" w:eastAsia="微软雅黑"/>
+                <w:rFonts w:ascii="微软雅黑" w:hAnsi="微软雅黑" w:eastAsia="微软雅黑"/>
                 <w:b w:val="0"/>
                 <w:sz w:val="20"/>
               </w:rPr>
@@ -905,7 +957,7 @@
             </w:pPr>
             <w:r>
               <w:rPr>
-                <w:rFonts w:ascii="Calibri" w:hAnsi="Calibri" w:eastAsia="微软雅黑"/>
+                <w:rFonts w:ascii="微软雅黑" w:hAnsi="微软雅黑" w:eastAsia="微软雅黑"/>
                 <w:b w:val="0"/>
                 <w:sz w:val="20"/>
               </w:rPr>
@@ -925,7 +977,7 @@
             </w:pPr>
             <w:r>
               <w:rPr>
-                <w:rFonts w:ascii="Calibri" w:hAnsi="Calibri" w:eastAsia="微软雅黑"/>
+                <w:rFonts w:ascii="微软雅黑" w:hAnsi="微软雅黑" w:eastAsia="微软雅黑"/>
                 <w:b w:val="0"/>
                 <w:sz w:val="20"/>
               </w:rPr>
@@ -943,11 +995,11 @@
             </w:pPr>
             <w:r>
               <w:rPr>
-                <w:rFonts w:ascii="Calibri" w:hAnsi="Calibri" w:eastAsia="微软雅黑"/>
+                <w:rFonts w:ascii="微软雅黑" w:hAnsi="微软雅黑" w:eastAsia="微软雅黑"/>
                 <w:b w:val="0"/>
                 <w:sz w:val="20"/>
               </w:rPr>
-              <w:t>实现 RBAC、JWT、字段级控制、审计与通知治理。</w:t>
+              <w:t>实现 RBAC、JWT、Redis 会话、字段级控制、审计与通知治理。</w:t>
             </w:r>
           </w:p>
         </w:tc>
@@ -963,7 +1015,7 @@
             </w:pPr>
             <w:r>
               <w:rPr>
-                <w:rFonts w:ascii="Calibri" w:hAnsi="Calibri" w:eastAsia="微软雅黑"/>
+                <w:rFonts w:ascii="微软雅黑" w:hAnsi="微软雅黑" w:eastAsia="微软雅黑"/>
                 <w:b w:val="0"/>
                 <w:sz w:val="20"/>
               </w:rPr>
@@ -981,7 +1033,7 @@
             </w:pPr>
             <w:r>
               <w:rPr>
-                <w:rFonts w:ascii="Calibri" w:hAnsi="Calibri" w:eastAsia="微软雅黑"/>
+                <w:rFonts w:ascii="微软雅黑" w:hAnsi="微软雅黑" w:eastAsia="微软雅黑"/>
                 <w:b w:val="0"/>
                 <w:sz w:val="20"/>
               </w:rPr>
@@ -1001,7 +1053,7 @@
             </w:pPr>
             <w:r>
               <w:rPr>
-                <w:rFonts w:ascii="Calibri" w:hAnsi="Calibri" w:eastAsia="微软雅黑"/>
+                <w:rFonts w:ascii="微软雅黑" w:hAnsi="微软雅黑" w:eastAsia="微软雅黑"/>
                 <w:b w:val="0"/>
                 <w:sz w:val="20"/>
               </w:rPr>
@@ -1019,7 +1071,7 @@
             </w:pPr>
             <w:r>
               <w:rPr>
-                <w:rFonts w:ascii="Calibri" w:hAnsi="Calibri" w:eastAsia="微软雅黑"/>
+                <w:rFonts w:ascii="微软雅黑" w:hAnsi="微软雅黑" w:eastAsia="微软雅黑"/>
                 <w:b w:val="0"/>
                 <w:sz w:val="20"/>
               </w:rPr>
@@ -1028,7 +1080,129 @@
           </w:p>
         </w:tc>
       </w:tr>
+      <w:tr>
+        <w:tc>
+          <w:tcPr>
+            <w:tcW w:type="dxa" w:w="4680"/>
+          </w:tcPr>
+          <w:p>
+            <w:pPr>
+              <w:spacing w:line="288" w:lineRule="auto"/>
+            </w:pPr>
+            <w:r>
+              <w:rPr>
+                <w:rFonts w:ascii="微软雅黑" w:hAnsi="微软雅黑" w:eastAsia="微软雅黑"/>
+                <w:b w:val="0"/>
+                <w:sz w:val="20"/>
+              </w:rPr>
+              <w:t>字典与主数据治理</w:t>
+            </w:r>
+          </w:p>
+        </w:tc>
+        <w:tc>
+          <w:tcPr>
+            <w:tcW w:type="dxa" w:w="4680"/>
+          </w:tcPr>
+          <w:p>
+            <w:pPr>
+              <w:spacing w:line="288" w:lineRule="auto"/>
+            </w:pPr>
+            <w:r>
+              <w:rPr>
+                <w:rFonts w:ascii="微软雅黑" w:hAnsi="微软雅黑" w:eastAsia="微软雅黑"/>
+                <w:b w:val="0"/>
+                <w:sz w:val="20"/>
+              </w:rPr>
+              <w:t>统一管理状态字典、颜色字典、枚举项和页面选择器来源，支撑全站配置收口。</w:t>
+            </w:r>
+          </w:p>
+        </w:tc>
+      </w:tr>
     </w:tbl>
+    <w:p>
+      <w:pPr>
+        <w:pStyle w:val="Heading2"/>
+        <w:spacing w:line="288" w:lineRule="auto"/>
+      </w:pPr>
+      <w:r>
+        <w:rPr>
+          <w:rFonts w:ascii="微软雅黑" w:hAnsi="微软雅黑" w:eastAsia="微软雅黑"/>
+          <w:b/>
+          <w:sz w:val="28"/>
+        </w:rPr>
+        <w:t>4.2 认证与会话运行设计</w:t>
+      </w:r>
+    </w:p>
+    <w:p>
+      <w:pPr>
+        <w:pStyle w:val="ListBullet"/>
+        <w:spacing w:line="288" w:lineRule="auto"/>
+      </w:pPr>
+      <w:r>
+        <w:rPr>
+          <w:rFonts w:ascii="微软雅黑" w:hAnsi="微软雅黑" w:eastAsia="微软雅黑"/>
+          <w:b w:val="0"/>
+          <w:sz w:val="24"/>
+        </w:rPr>
+        <w:t>后端运行时读取 backend/.env 和 backend/.env.local，backend/.env.example 仅作为模板文件。</w:t>
+      </w:r>
+    </w:p>
+    <w:p>
+      <w:pPr>
+        <w:pStyle w:val="ListBullet"/>
+        <w:spacing w:line="288" w:lineRule="auto"/>
+      </w:pPr>
+      <w:r>
+        <w:rPr>
+          <w:rFonts w:ascii="微软雅黑" w:hAnsi="微软雅黑" w:eastAsia="微软雅黑"/>
+          <w:b w:val="0"/>
+          <w:sz w:val="24"/>
+        </w:rPr>
+        <w:t>登录接口在用户名密码校验通过后创建 Redis 会话，并将 sid 写入 access token 与 refresh token。</w:t>
+      </w:r>
+    </w:p>
+    <w:p>
+      <w:pPr>
+        <w:pStyle w:val="ListBullet"/>
+        <w:spacing w:line="288" w:lineRule="auto"/>
+      </w:pPr>
+      <w:r>
+        <w:rPr>
+          <w:rFonts w:ascii="微软雅黑" w:hAnsi="微软雅黑" w:eastAsia="微软雅黑"/>
+          <w:b w:val="0"/>
+          <w:sz w:val="24"/>
+        </w:rPr>
+        <w:t>前端路由守卫会记录受保护页面目标地址，登录成功后优先恢复 redirect 指向的页面。</w:t>
+      </w:r>
+    </w:p>
+    <w:p>
+      <w:pPr>
+        <w:pStyle w:val="ListBullet"/>
+        <w:spacing w:line="288" w:lineRule="auto"/>
+      </w:pPr>
+      <w:r>
+        <w:rPr>
+          <w:rFonts w:ascii="微软雅黑" w:hAnsi="微软雅黑" w:eastAsia="微软雅黑"/>
+          <w:b w:val="0"/>
+          <w:sz w:val="24"/>
+        </w:rPr>
+        <w:t>前端在收到 401 时自动清理本地 token，跳回登录页，并保留原始页面地址供重新登录后恢复。</w:t>
+      </w:r>
+    </w:p>
+    <w:p>
+      <w:pPr>
+        <w:pStyle w:val="ListBullet"/>
+        <w:spacing w:line="288" w:lineRule="auto"/>
+      </w:pPr>
+      <w:r>
+        <w:rPr>
+          <w:rFonts w:ascii="微软雅黑" w:hAnsi="微软雅黑" w:eastAsia="微软雅黑"/>
+          <w:b w:val="0"/>
+          <w:sz w:val="24"/>
+        </w:rPr>
+        <w:t>注销接口会撤销 Redis 会话，旧 token 会立即失效，避免仅删除前端 localStorage 造成的伪注销。</w:t>
+      </w:r>
+    </w:p>
     <w:p>
       <w:pPr>
         <w:pStyle w:val="Heading1"/>
@@ -1036,7 +1210,7 @@
       </w:pPr>
       <w:r>
         <w:rPr>
-          <w:rFonts w:ascii="Calibri" w:hAnsi="Calibri" w:eastAsia="微软雅黑"/>
+          <w:rFonts w:ascii="微软雅黑" w:hAnsi="微软雅黑" w:eastAsia="微软雅黑"/>
           <w:b/>
           <w:sz w:val="32"/>
         </w:rPr>
@@ -1049,7 +1223,7 @@
       </w:pPr>
       <w:r>
         <w:rPr>
-          <w:rFonts w:ascii="Calibri" w:hAnsi="Calibri" w:eastAsia="微软雅黑"/>
+          <w:rFonts w:ascii="微软雅黑" w:hAnsi="微软雅黑" w:eastAsia="微软雅黑"/>
           <w:b w:val="0"/>
           <w:sz w:val="24"/>
         </w:rPr>
@@ -1099,7 +1273,7 @@
       </w:pPr>
       <w:r>
         <w:rPr>
-          <w:rFonts w:ascii="Calibri" w:hAnsi="Calibri" w:eastAsia="微软雅黑"/>
+          <w:rFonts w:ascii="微软雅黑" w:hAnsi="微软雅黑" w:eastAsia="微软雅黑"/>
           <w:b w:val="0"/>
           <w:sz w:val="20"/>
         </w:rPr>
@@ -1113,7 +1287,7 @@
       </w:pPr>
       <w:r>
         <w:rPr>
-          <w:rFonts w:ascii="Calibri" w:hAnsi="Calibri" w:eastAsia="微软雅黑"/>
+          <w:rFonts w:ascii="微软雅黑" w:hAnsi="微软雅黑" w:eastAsia="微软雅黑"/>
           <w:b w:val="0"/>
           <w:sz w:val="24"/>
         </w:rPr>
@@ -1127,7 +1301,7 @@
       </w:pPr>
       <w:r>
         <w:rPr>
-          <w:rFonts w:ascii="Calibri" w:hAnsi="Calibri" w:eastAsia="微软雅黑"/>
+          <w:rFonts w:ascii="微软雅黑" w:hAnsi="微软雅黑" w:eastAsia="微软雅黑"/>
           <w:b w:val="0"/>
           <w:sz w:val="24"/>
         </w:rPr>
@@ -1141,7 +1315,7 @@
       </w:pPr>
       <w:r>
         <w:rPr>
-          <w:rFonts w:ascii="Calibri" w:hAnsi="Calibri" w:eastAsia="微软雅黑"/>
+          <w:rFonts w:ascii="微软雅黑" w:hAnsi="微软雅黑" w:eastAsia="微软雅黑"/>
           <w:b w:val="0"/>
           <w:sz w:val="24"/>
         </w:rPr>
@@ -1155,7 +1329,7 @@
       </w:pPr>
       <w:r>
         <w:rPr>
-          <w:rFonts w:ascii="Calibri" w:hAnsi="Calibri" w:eastAsia="微软雅黑"/>
+          <w:rFonts w:ascii="微软雅黑" w:hAnsi="微软雅黑" w:eastAsia="微软雅黑"/>
           <w:b w:val="0"/>
           <w:sz w:val="24"/>
         </w:rPr>
@@ -1169,7 +1343,7 @@
       </w:pPr>
       <w:r>
         <w:rPr>
-          <w:rFonts w:ascii="Calibri" w:hAnsi="Calibri" w:eastAsia="微软雅黑"/>
+          <w:rFonts w:ascii="微软雅黑" w:hAnsi="微软雅黑" w:eastAsia="微软雅黑"/>
           <w:b w:val="0"/>
           <w:sz w:val="24"/>
         </w:rPr>
@@ -1219,7 +1393,7 @@
       </w:pPr>
       <w:r>
         <w:rPr>
-          <w:rFonts w:ascii="Calibri" w:hAnsi="Calibri" w:eastAsia="微软雅黑"/>
+          <w:rFonts w:ascii="微软雅黑" w:hAnsi="微软雅黑" w:eastAsia="微软雅黑"/>
           <w:b w:val="0"/>
           <w:sz w:val="20"/>
         </w:rPr>
@@ -1233,7 +1407,7 @@
       </w:pPr>
       <w:r>
         <w:rPr>
-          <w:rFonts w:ascii="Calibri" w:hAnsi="Calibri" w:eastAsia="微软雅黑"/>
+          <w:rFonts w:ascii="微软雅黑" w:hAnsi="微软雅黑" w:eastAsia="微软雅黑"/>
           <w:b w:val="0"/>
           <w:sz w:val="24"/>
         </w:rPr>
@@ -1247,7 +1421,7 @@
       </w:pPr>
       <w:r>
         <w:rPr>
-          <w:rFonts w:ascii="Calibri" w:hAnsi="Calibri" w:eastAsia="微软雅黑"/>
+          <w:rFonts w:ascii="微软雅黑" w:hAnsi="微软雅黑" w:eastAsia="微软雅黑"/>
           <w:b w:val="0"/>
           <w:sz w:val="24"/>
         </w:rPr>
@@ -1261,11 +1435,151 @@
       </w:pPr>
       <w:r>
         <w:rPr>
-          <w:rFonts w:ascii="Calibri" w:hAnsi="Calibri" w:eastAsia="微软雅黑"/>
+          <w:rFonts w:ascii="微软雅黑" w:hAnsi="微软雅黑" w:eastAsia="微软雅黑"/>
           <w:b w:val="0"/>
           <w:sz w:val="24"/>
         </w:rPr>
         <w:t>学位申请审批: 论文查重、盲审、预答辩、正式答辩和授位审议构成严格串行链路。</w:t>
+      </w:r>
+    </w:p>
+    <w:p>
+      <w:pPr>
+        <w:pStyle w:val="Heading2"/>
+        <w:spacing w:line="288" w:lineRule="auto"/>
+      </w:pPr>
+      <w:r>
+        <w:rPr>
+          <w:rFonts w:ascii="微软雅黑" w:hAnsi="微软雅黑" w:eastAsia="微软雅黑"/>
+          <w:b/>
+          <w:sz w:val="28"/>
+        </w:rPr>
+        <w:t>5.1 培养管理治理增强</w:t>
+      </w:r>
+    </w:p>
+    <w:p>
+      <w:pPr>
+        <w:pStyle w:val="ListBullet"/>
+        <w:spacing w:line="288" w:lineRule="auto"/>
+      </w:pPr>
+      <w:r>
+        <w:rPr>
+          <w:rFonts w:ascii="微软雅黑" w:hAnsi="微软雅黑" w:eastAsia="微软雅黑"/>
+          <w:b w:val="0"/>
+          <w:sz w:val="24"/>
+        </w:rPr>
+        <w:t>培养方案、科研报告、外出研修三类页面均提供关键字、状态、导师或审阅人等查询条件。</w:t>
+      </w:r>
+    </w:p>
+    <w:p>
+      <w:pPr>
+        <w:pStyle w:val="ListBullet"/>
+        <w:spacing w:line="288" w:lineRule="auto"/>
+      </w:pPr>
+      <w:r>
+        <w:rPr>
+          <w:rFonts w:ascii="微软雅黑" w:hAnsi="微软雅黑" w:eastAsia="微软雅黑"/>
+          <w:b w:val="0"/>
+          <w:sz w:val="24"/>
+        </w:rPr>
+        <w:t>状态类字段统一改为字典选择，不再依赖自由文本录入。</w:t>
+      </w:r>
+    </w:p>
+    <w:p>
+      <w:pPr>
+        <w:pStyle w:val="ListBullet"/>
+        <w:spacing w:line="288" w:lineRule="auto"/>
+      </w:pPr>
+      <w:r>
+        <w:rPr>
+          <w:rFonts w:ascii="微软雅黑" w:hAnsi="微软雅黑" w:eastAsia="微软雅黑"/>
+          <w:b w:val="0"/>
+          <w:sz w:val="24"/>
+        </w:rPr>
+        <w:t>列表页统一支持单条删除与批量删除，按钮文案按业务语义显示。</w:t>
+      </w:r>
+    </w:p>
+    <w:p>
+      <w:pPr>
+        <w:pStyle w:val="ListBullet"/>
+        <w:spacing w:line="288" w:lineRule="auto"/>
+      </w:pPr>
+      <w:r>
+        <w:rPr>
+          <w:rFonts w:ascii="微软雅黑" w:hAnsi="微软雅黑" w:eastAsia="微软雅黑"/>
+          <w:b w:val="0"/>
+          <w:sz w:val="24"/>
+        </w:rPr>
+        <w:t>培养管理接口新增 /training/options，用于前端加载报告周期、方案状态、研修类型等字典项。</w:t>
+      </w:r>
+    </w:p>
+    <w:p>
+      <w:pPr>
+        <w:pStyle w:val="Heading2"/>
+        <w:spacing w:line="288" w:lineRule="auto"/>
+      </w:pPr>
+      <w:r>
+        <w:rPr>
+          <w:rFonts w:ascii="微软雅黑" w:hAnsi="微软雅黑" w:eastAsia="微软雅黑"/>
+          <w:b/>
+          <w:sz w:val="28"/>
+        </w:rPr>
+        <w:t>5.2 学生与团队主数据治理设计</w:t>
+      </w:r>
+    </w:p>
+    <w:p>
+      <w:pPr>
+        <w:pStyle w:val="ListBullet"/>
+        <w:spacing w:line="288" w:lineRule="auto"/>
+      </w:pPr>
+      <w:r>
+        <w:rPr>
+          <w:rFonts w:ascii="微软雅黑" w:hAnsi="微软雅黑" w:eastAsia="微软雅黑"/>
+          <w:b w:val="0"/>
+          <w:sz w:val="24"/>
+        </w:rPr>
+        <w:t>学生主档新增与编辑时，所属团队和导师均改为主数据受控选择，不再允许自由文本录入。</w:t>
+      </w:r>
+    </w:p>
+    <w:p>
+      <w:pPr>
+        <w:pStyle w:val="ListBullet"/>
+        <w:spacing w:line="288" w:lineRule="auto"/>
+      </w:pPr>
+      <w:r>
+        <w:rPr>
+          <w:rFonts w:ascii="微软雅黑" w:hAnsi="微软雅黑" w:eastAsia="微软雅黑"/>
+          <w:b w:val="0"/>
+          <w:sz w:val="24"/>
+        </w:rPr>
+        <w:t>团队实体采用本体化建模，核心属性包括团队编码、负责人导师、团队导师集合、研究方向、状态与成立日期。</w:t>
+      </w:r>
+    </w:p>
+    <w:p>
+      <w:pPr>
+        <w:pStyle w:val="ListBullet"/>
+        <w:spacing w:line="288" w:lineRule="auto"/>
+      </w:pPr>
+      <w:r>
+        <w:rPr>
+          <w:rFonts w:ascii="微软雅黑" w:hAnsi="微软雅黑" w:eastAsia="微软雅黑"/>
+          <w:b w:val="0"/>
+          <w:sz w:val="24"/>
+        </w:rPr>
+        <w:t>团队与学生、导师形成稳定关联，保存学生主档时会校验导师是否属于所选团队。</w:t>
+      </w:r>
+    </w:p>
+    <w:p>
+      <w:pPr>
+        <w:pStyle w:val="ListBullet"/>
+        <w:spacing w:line="288" w:lineRule="auto"/>
+      </w:pPr>
+      <w:r>
+        <w:rPr>
+          <w:rFonts w:ascii="微软雅黑" w:hAnsi="微软雅黑" w:eastAsia="微软雅黑"/>
+          <w:b w:val="0"/>
+          <w:sz w:val="24"/>
+        </w:rPr>
+        <w:t>团队管理页支持查询、状态筛选、负责人过滤、单条删除与批量删除，并实时统计团队学生数。</w:t>
       </w:r>
     </w:p>
     <w:p>
@@ -1275,7 +1589,7 @@
       </w:pPr>
       <w:r>
         <w:rPr>
-          <w:rFonts w:ascii="Calibri" w:hAnsi="Calibri" w:eastAsia="微软雅黑"/>
+          <w:rFonts w:ascii="微软雅黑" w:hAnsi="微软雅黑" w:eastAsia="微软雅黑"/>
           <w:b/>
           <w:sz w:val="32"/>
         </w:rPr>
@@ -1288,11 +1602,11 @@
       </w:pPr>
       <w:r>
         <w:rPr>
-          <w:rFonts w:ascii="Calibri" w:hAnsi="Calibri" w:eastAsia="微软雅黑"/>
+          <w:rFonts w:ascii="微软雅黑" w:hAnsi="微软雅黑" w:eastAsia="微软雅黑"/>
           <w:b w:val="0"/>
           <w:sz w:val="24"/>
         </w:rPr>
-        <w:t>数据库采用 PostgreSQL 关系建模，核心策略包括：主数据唯一、关键对象版本化、日志软删除、统计视图前置和关键流程关系清晰可追溯。</w:t>
+        <w:t>数据库采用 PostgreSQL 关系建模，核心策略包括：主数据唯一、关键对象版本化、字典统一治理、日志软删除、统计视图前置和关键流程关系清晰可追溯。</w:t>
       </w:r>
     </w:p>
     <w:p>
@@ -1338,11 +1652,81 @@
       </w:pPr>
       <w:r>
         <w:rPr>
-          <w:rFonts w:ascii="Calibri" w:hAnsi="Calibri" w:eastAsia="微软雅黑"/>
+          <w:rFonts w:ascii="微软雅黑" w:hAnsi="微软雅黑" w:eastAsia="微软雅黑"/>
           <w:b w:val="0"/>
           <w:sz w:val="20"/>
         </w:rPr>
         <w:t>图：数据库 ER 图</w:t>
+      </w:r>
+    </w:p>
+    <w:p>
+      <w:pPr>
+        <w:pStyle w:val="ListBullet"/>
+        <w:spacing w:line="288" w:lineRule="auto"/>
+      </w:pPr>
+      <w:r>
+        <w:rPr>
+          <w:rFonts w:ascii="微软雅黑" w:hAnsi="微软雅黑" w:eastAsia="微软雅黑"/>
+          <w:b w:val="0"/>
+          <w:sz w:val="24"/>
+        </w:rPr>
+        <w:t>关系主表与运行态镜像表共存，但业务系统运行期间只允许 PostgreSQL 作为唯一事实来源，不再依赖 JSON 演示文件。</w:t>
+      </w:r>
+    </w:p>
+    <w:p>
+      <w:pPr>
+        <w:pStyle w:val="ListBullet"/>
+        <w:spacing w:line="288" w:lineRule="auto"/>
+      </w:pPr>
+      <w:r>
+        <w:rPr>
+          <w:rFonts w:ascii="微软雅黑" w:hAnsi="微软雅黑" w:eastAsia="微软雅黑"/>
+          <w:b w:val="0"/>
+          <w:sz w:val="24"/>
+        </w:rPr>
+        <w:t>字典设计采用“字典类型 + 字典数据”两层结构，既管理 label/value，也管理 color_type、css_class 等展示语义。</w:t>
+      </w:r>
+    </w:p>
+    <w:p>
+      <w:pPr>
+        <w:pStyle w:val="ListBullet"/>
+        <w:spacing w:line="288" w:lineRule="auto"/>
+      </w:pPr>
+      <w:r>
+        <w:rPr>
+          <w:rFonts w:ascii="微软雅黑" w:hAnsi="微软雅黑" w:eastAsia="微软雅黑"/>
+          <w:b w:val="0"/>
+          <w:sz w:val="24"/>
+        </w:rPr>
+        <w:t>学生、导师、团队、招生、培养、学位均通过外键或历史表保持可追溯关系，避免页面层自由拼装对象关系。</w:t>
+      </w:r>
+    </w:p>
+    <w:p>
+      <w:pPr>
+        <w:pStyle w:val="ListBullet"/>
+        <w:spacing w:line="288" w:lineRule="auto"/>
+      </w:pPr>
+      <w:r>
+        <w:rPr>
+          <w:rFonts w:ascii="微软雅黑" w:hAnsi="微软雅黑" w:eastAsia="微软雅黑"/>
+          <w:b w:val="0"/>
+          <w:sz w:val="24"/>
+        </w:rPr>
+        <w:t>运行态镜像表承载 DemoManagementStore 的统一持久化结果，确保内存状态、接口返回和数据库对象持续同步。</w:t>
+      </w:r>
+    </w:p>
+    <w:p>
+      <w:pPr>
+        <w:pStyle w:val="ListBullet"/>
+        <w:spacing w:line="288" w:lineRule="auto"/>
+      </w:pPr>
+      <w:r>
+        <w:rPr>
+          <w:rFonts w:ascii="微软雅黑" w:hAnsi="微软雅黑" w:eastAsia="微软雅黑"/>
+          <w:b w:val="0"/>
+          <w:sz w:val="24"/>
+        </w:rPr>
+        <w:t>所有表采用 created_at、updated_at 与 is_deleted 的统一治理字段，支撑审计、回放与逻辑删除策略。</w:t>
       </w:r>
     </w:p>
     <w:p>
@@ -1352,7 +1736,7 @@
       </w:pPr>
       <w:r>
         <w:rPr>
-          <w:rFonts w:ascii="Calibri" w:hAnsi="Calibri" w:eastAsia="微软雅黑"/>
+          <w:rFonts w:ascii="微软雅黑" w:hAnsi="微软雅黑" w:eastAsia="微软雅黑"/>
           <w:b/>
           <w:sz w:val="24"/>
         </w:rPr>
@@ -1381,7 +1765,7 @@
             </w:pPr>
             <w:r>
               <w:rPr>
-                <w:rFonts w:ascii="Calibri" w:hAnsi="Calibri" w:eastAsia="微软雅黑"/>
+                <w:rFonts w:ascii="微软雅黑" w:hAnsi="微软雅黑" w:eastAsia="微软雅黑"/>
                 <w:b w:val="0"/>
                 <w:sz w:val="20"/>
               </w:rPr>
@@ -1399,7 +1783,7 @@
             </w:pPr>
             <w:r>
               <w:rPr>
-                <w:rFonts w:ascii="Calibri" w:hAnsi="Calibri" w:eastAsia="微软雅黑"/>
+                <w:rFonts w:ascii="微软雅黑" w:hAnsi="微软雅黑" w:eastAsia="微软雅黑"/>
                 <w:b w:val="0"/>
                 <w:sz w:val="20"/>
               </w:rPr>
@@ -1417,7 +1801,7 @@
             </w:pPr>
             <w:r>
               <w:rPr>
-                <w:rFonts w:ascii="Calibri" w:hAnsi="Calibri" w:eastAsia="微软雅黑"/>
+                <w:rFonts w:ascii="微软雅黑" w:hAnsi="微软雅黑" w:eastAsia="微软雅黑"/>
                 <w:b w:val="0"/>
                 <w:sz w:val="20"/>
               </w:rPr>
@@ -1437,7 +1821,7 @@
             </w:pPr>
             <w:r>
               <w:rPr>
-                <w:rFonts w:ascii="Calibri" w:hAnsi="Calibri" w:eastAsia="微软雅黑"/>
+                <w:rFonts w:ascii="微软雅黑" w:hAnsi="微软雅黑" w:eastAsia="微软雅黑"/>
                 <w:b w:val="0"/>
                 <w:sz w:val="20"/>
               </w:rPr>
@@ -1455,7 +1839,7 @@
             </w:pPr>
             <w:r>
               <w:rPr>
-                <w:rFonts w:ascii="Calibri" w:hAnsi="Calibri" w:eastAsia="微软雅黑"/>
+                <w:rFonts w:ascii="微软雅黑" w:hAnsi="微软雅黑" w:eastAsia="微软雅黑"/>
                 <w:b w:val="0"/>
                 <w:sz w:val="20"/>
               </w:rPr>
@@ -1473,7 +1857,7 @@
             </w:pPr>
             <w:r>
               <w:rPr>
-                <w:rFonts w:ascii="Calibri" w:hAnsi="Calibri" w:eastAsia="微软雅黑"/>
+                <w:rFonts w:ascii="微软雅黑" w:hAnsi="微软雅黑" w:eastAsia="微软雅黑"/>
                 <w:b w:val="0"/>
                 <w:sz w:val="20"/>
               </w:rPr>
@@ -1493,7 +1877,7 @@
             </w:pPr>
             <w:r>
               <w:rPr>
-                <w:rFonts w:ascii="Calibri" w:hAnsi="Calibri" w:eastAsia="微软雅黑"/>
+                <w:rFonts w:ascii="微软雅黑" w:hAnsi="微软雅黑" w:eastAsia="微软雅黑"/>
                 <w:b w:val="0"/>
                 <w:sz w:val="20"/>
               </w:rPr>
@@ -1511,7 +1895,7 @@
             </w:pPr>
             <w:r>
               <w:rPr>
-                <w:rFonts w:ascii="Calibri" w:hAnsi="Calibri" w:eastAsia="微软雅黑"/>
+                <w:rFonts w:ascii="微软雅黑" w:hAnsi="微软雅黑" w:eastAsia="微软雅黑"/>
                 <w:b w:val="0"/>
                 <w:sz w:val="20"/>
               </w:rPr>
@@ -1529,7 +1913,7 @@
             </w:pPr>
             <w:r>
               <w:rPr>
-                <w:rFonts w:ascii="Calibri" w:hAnsi="Calibri" w:eastAsia="微软雅黑"/>
+                <w:rFonts w:ascii="微软雅黑" w:hAnsi="微软雅黑" w:eastAsia="微软雅黑"/>
                 <w:b w:val="0"/>
                 <w:sz w:val="20"/>
               </w:rPr>
@@ -1549,7 +1933,7 @@
             </w:pPr>
             <w:r>
               <w:rPr>
-                <w:rFonts w:ascii="Calibri" w:hAnsi="Calibri" w:eastAsia="微软雅黑"/>
+                <w:rFonts w:ascii="微软雅黑" w:hAnsi="微软雅黑" w:eastAsia="微软雅黑"/>
                 <w:b w:val="0"/>
                 <w:sz w:val="20"/>
               </w:rPr>
@@ -1567,7 +1951,7 @@
             </w:pPr>
             <w:r>
               <w:rPr>
-                <w:rFonts w:ascii="Calibri" w:hAnsi="Calibri" w:eastAsia="微软雅黑"/>
+                <w:rFonts w:ascii="微软雅黑" w:hAnsi="微软雅黑" w:eastAsia="微软雅黑"/>
                 <w:b w:val="0"/>
                 <w:sz w:val="20"/>
               </w:rPr>
@@ -1585,7 +1969,7 @@
             </w:pPr>
             <w:r>
               <w:rPr>
-                <w:rFonts w:ascii="Calibri" w:hAnsi="Calibri" w:eastAsia="微软雅黑"/>
+                <w:rFonts w:ascii="微软雅黑" w:hAnsi="微软雅黑" w:eastAsia="微软雅黑"/>
                 <w:b w:val="0"/>
                 <w:sz w:val="20"/>
               </w:rPr>
@@ -1605,7 +1989,7 @@
             </w:pPr>
             <w:r>
               <w:rPr>
-                <w:rFonts w:ascii="Calibri" w:hAnsi="Calibri" w:eastAsia="微软雅黑"/>
+                <w:rFonts w:ascii="微软雅黑" w:hAnsi="微软雅黑" w:eastAsia="微软雅黑"/>
                 <w:b w:val="0"/>
                 <w:sz w:val="20"/>
               </w:rPr>
@@ -1623,7 +2007,7 @@
             </w:pPr>
             <w:r>
               <w:rPr>
-                <w:rFonts w:ascii="Calibri" w:hAnsi="Calibri" w:eastAsia="微软雅黑"/>
+                <w:rFonts w:ascii="微软雅黑" w:hAnsi="微软雅黑" w:eastAsia="微软雅黑"/>
                 <w:b w:val="0"/>
                 <w:sz w:val="20"/>
               </w:rPr>
@@ -1641,7 +2025,7 @@
             </w:pPr>
             <w:r>
               <w:rPr>
-                <w:rFonts w:ascii="Calibri" w:hAnsi="Calibri" w:eastAsia="微软雅黑"/>
+                <w:rFonts w:ascii="微软雅黑" w:hAnsi="微软雅黑" w:eastAsia="微软雅黑"/>
                 <w:b w:val="0"/>
                 <w:sz w:val="20"/>
               </w:rPr>
@@ -1661,7 +2045,7 @@
             </w:pPr>
             <w:r>
               <w:rPr>
-                <w:rFonts w:ascii="Calibri" w:hAnsi="Calibri" w:eastAsia="微软雅黑"/>
+                <w:rFonts w:ascii="微软雅黑" w:hAnsi="微软雅黑" w:eastAsia="微软雅黑"/>
                 <w:b w:val="0"/>
                 <w:sz w:val="20"/>
               </w:rPr>
@@ -1679,7 +2063,7 @@
             </w:pPr>
             <w:r>
               <w:rPr>
-                <w:rFonts w:ascii="Calibri" w:hAnsi="Calibri" w:eastAsia="微软雅黑"/>
+                <w:rFonts w:ascii="微软雅黑" w:hAnsi="微软雅黑" w:eastAsia="微软雅黑"/>
                 <w:b w:val="0"/>
                 <w:sz w:val="20"/>
               </w:rPr>
@@ -1697,7 +2081,7 @@
             </w:pPr>
             <w:r>
               <w:rPr>
-                <w:rFonts w:ascii="Calibri" w:hAnsi="Calibri" w:eastAsia="微软雅黑"/>
+                <w:rFonts w:ascii="微软雅黑" w:hAnsi="微软雅黑" w:eastAsia="微软雅黑"/>
                 <w:b w:val="0"/>
                 <w:sz w:val="20"/>
               </w:rPr>
@@ -1717,7 +2101,7 @@
             </w:pPr>
             <w:r>
               <w:rPr>
-                <w:rFonts w:ascii="Calibri" w:hAnsi="Calibri" w:eastAsia="微软雅黑"/>
+                <w:rFonts w:ascii="微软雅黑" w:hAnsi="微软雅黑" w:eastAsia="微软雅黑"/>
                 <w:b w:val="0"/>
                 <w:sz w:val="20"/>
               </w:rPr>
@@ -1735,7 +2119,7 @@
             </w:pPr>
             <w:r>
               <w:rPr>
-                <w:rFonts w:ascii="Calibri" w:hAnsi="Calibri" w:eastAsia="微软雅黑"/>
+                <w:rFonts w:ascii="微软雅黑" w:hAnsi="微软雅黑" w:eastAsia="微软雅黑"/>
                 <w:b w:val="0"/>
                 <w:sz w:val="20"/>
               </w:rPr>
@@ -1753,7 +2137,7 @@
             </w:pPr>
             <w:r>
               <w:rPr>
-                <w:rFonts w:ascii="Calibri" w:hAnsi="Calibri" w:eastAsia="微软雅黑"/>
+                <w:rFonts w:ascii="微软雅黑" w:hAnsi="微软雅黑" w:eastAsia="微软雅黑"/>
                 <w:b w:val="0"/>
                 <w:sz w:val="20"/>
               </w:rPr>
@@ -1773,7 +2157,7 @@
             </w:pPr>
             <w:r>
               <w:rPr>
-                <w:rFonts w:ascii="Calibri" w:hAnsi="Calibri" w:eastAsia="微软雅黑"/>
+                <w:rFonts w:ascii="微软雅黑" w:hAnsi="微软雅黑" w:eastAsia="微软雅黑"/>
                 <w:b w:val="0"/>
                 <w:sz w:val="20"/>
               </w:rPr>
@@ -1791,7 +2175,7 @@
             </w:pPr>
             <w:r>
               <w:rPr>
-                <w:rFonts w:ascii="Calibri" w:hAnsi="Calibri" w:eastAsia="微软雅黑"/>
+                <w:rFonts w:ascii="微软雅黑" w:hAnsi="微软雅黑" w:eastAsia="微软雅黑"/>
                 <w:b w:val="0"/>
                 <w:sz w:val="20"/>
               </w:rPr>
@@ -1809,7 +2193,7 @@
             </w:pPr>
             <w:r>
               <w:rPr>
-                <w:rFonts w:ascii="Calibri" w:hAnsi="Calibri" w:eastAsia="微软雅黑"/>
+                <w:rFonts w:ascii="微软雅黑" w:hAnsi="微软雅黑" w:eastAsia="微软雅黑"/>
                 <w:b w:val="0"/>
                 <w:sz w:val="20"/>
               </w:rPr>
@@ -1829,7 +2213,7 @@
             </w:pPr>
             <w:r>
               <w:rPr>
-                <w:rFonts w:ascii="Calibri" w:hAnsi="Calibri" w:eastAsia="微软雅黑"/>
+                <w:rFonts w:ascii="微软雅黑" w:hAnsi="微软雅黑" w:eastAsia="微软雅黑"/>
                 <w:b w:val="0"/>
                 <w:sz w:val="20"/>
               </w:rPr>
@@ -1847,7 +2231,7 @@
             </w:pPr>
             <w:r>
               <w:rPr>
-                <w:rFonts w:ascii="Calibri" w:hAnsi="Calibri" w:eastAsia="微软雅黑"/>
+                <w:rFonts w:ascii="微软雅黑" w:hAnsi="微软雅黑" w:eastAsia="微软雅黑"/>
                 <w:b w:val="0"/>
                 <w:sz w:val="20"/>
               </w:rPr>
@@ -1865,7 +2249,7 @@
             </w:pPr>
             <w:r>
               <w:rPr>
-                <w:rFonts w:ascii="Calibri" w:hAnsi="Calibri" w:eastAsia="微软雅黑"/>
+                <w:rFonts w:ascii="微软雅黑" w:hAnsi="微软雅黑" w:eastAsia="微软雅黑"/>
                 <w:b w:val="0"/>
                 <w:sz w:val="20"/>
               </w:rPr>
@@ -1885,7 +2269,7 @@
             </w:pPr>
             <w:r>
               <w:rPr>
-                <w:rFonts w:ascii="Calibri" w:hAnsi="Calibri" w:eastAsia="微软雅黑"/>
+                <w:rFonts w:ascii="微软雅黑" w:hAnsi="微软雅黑" w:eastAsia="微软雅黑"/>
                 <w:b w:val="0"/>
                 <w:sz w:val="20"/>
               </w:rPr>
@@ -1903,7 +2287,7 @@
             </w:pPr>
             <w:r>
               <w:rPr>
-                <w:rFonts w:ascii="Calibri" w:hAnsi="Calibri" w:eastAsia="微软雅黑"/>
+                <w:rFonts w:ascii="微软雅黑" w:hAnsi="微软雅黑" w:eastAsia="微软雅黑"/>
                 <w:b w:val="0"/>
                 <w:sz w:val="20"/>
               </w:rPr>
@@ -1921,7 +2305,7 @@
             </w:pPr>
             <w:r>
               <w:rPr>
-                <w:rFonts w:ascii="Calibri" w:hAnsi="Calibri" w:eastAsia="微软雅黑"/>
+                <w:rFonts w:ascii="微软雅黑" w:hAnsi="微软雅黑" w:eastAsia="微软雅黑"/>
                 <w:b w:val="0"/>
                 <w:sz w:val="20"/>
               </w:rPr>
@@ -1941,7 +2325,7 @@
             </w:pPr>
             <w:r>
               <w:rPr>
-                <w:rFonts w:ascii="Calibri" w:hAnsi="Calibri" w:eastAsia="微软雅黑"/>
+                <w:rFonts w:ascii="微软雅黑" w:hAnsi="微软雅黑" w:eastAsia="微软雅黑"/>
                 <w:b w:val="0"/>
                 <w:sz w:val="20"/>
               </w:rPr>
@@ -1959,7 +2343,7 @@
             </w:pPr>
             <w:r>
               <w:rPr>
-                <w:rFonts w:ascii="Calibri" w:hAnsi="Calibri" w:eastAsia="微软雅黑"/>
+                <w:rFonts w:ascii="微软雅黑" w:hAnsi="微软雅黑" w:eastAsia="微软雅黑"/>
                 <w:b w:val="0"/>
                 <w:sz w:val="20"/>
               </w:rPr>
@@ -1977,11 +2361,123 @@
             </w:pPr>
             <w:r>
               <w:rPr>
-                <w:rFonts w:ascii="Calibri" w:hAnsi="Calibri" w:eastAsia="微软雅黑"/>
+                <w:rFonts w:ascii="微软雅黑" w:hAnsi="微软雅黑" w:eastAsia="微软雅黑"/>
                 <w:b w:val="0"/>
                 <w:sz w:val="20"/>
               </w:rPr>
               <w:t>config_key, config_value</w:t>
+            </w:r>
+          </w:p>
+        </w:tc>
+      </w:tr>
+      <w:tr>
+        <w:tc>
+          <w:tcPr>
+            <w:tcW w:type="dxa" w:w="3120"/>
+          </w:tcPr>
+          <w:p>
+            <w:pPr>
+              <w:spacing w:line="288" w:lineRule="auto"/>
+            </w:pPr>
+            <w:r>
+              <w:rPr>
+                <w:rFonts w:ascii="微软雅黑" w:hAnsi="微软雅黑" w:eastAsia="微软雅黑"/>
+                <w:b w:val="0"/>
+                <w:sz w:val="20"/>
+              </w:rPr>
+              <w:t>dtlms_dict_types</w:t>
+            </w:r>
+          </w:p>
+        </w:tc>
+        <w:tc>
+          <w:tcPr>
+            <w:tcW w:type="dxa" w:w="3120"/>
+          </w:tcPr>
+          <w:p>
+            <w:pPr>
+              <w:spacing w:line="288" w:lineRule="auto"/>
+            </w:pPr>
+            <w:r>
+              <w:rPr>
+                <w:rFonts w:ascii="微软雅黑" w:hAnsi="微软雅黑" w:eastAsia="微软雅黑"/>
+                <w:b w:val="0"/>
+                <w:sz w:val="20"/>
+              </w:rPr>
+              <w:t>字典类型表</w:t>
+            </w:r>
+          </w:p>
+        </w:tc>
+        <w:tc>
+          <w:tcPr>
+            <w:tcW w:type="dxa" w:w="3120"/>
+          </w:tcPr>
+          <w:p>
+            <w:pPr>
+              <w:spacing w:line="288" w:lineRule="auto"/>
+            </w:pPr>
+            <w:r>
+              <w:rPr>
+                <w:rFonts w:ascii="微软雅黑" w:hAnsi="微软雅黑" w:eastAsia="微软雅黑"/>
+                <w:b w:val="0"/>
+                <w:sz w:val="20"/>
+              </w:rPr>
+              <w:t>dict_name, dict_type, status</w:t>
+            </w:r>
+          </w:p>
+        </w:tc>
+      </w:tr>
+      <w:tr>
+        <w:tc>
+          <w:tcPr>
+            <w:tcW w:type="dxa" w:w="3120"/>
+          </w:tcPr>
+          <w:p>
+            <w:pPr>
+              <w:spacing w:line="288" w:lineRule="auto"/>
+            </w:pPr>
+            <w:r>
+              <w:rPr>
+                <w:rFonts w:ascii="微软雅黑" w:hAnsi="微软雅黑" w:eastAsia="微软雅黑"/>
+                <w:b w:val="0"/>
+                <w:sz w:val="20"/>
+              </w:rPr>
+              <w:t>dtlms_dict_data</w:t>
+            </w:r>
+          </w:p>
+        </w:tc>
+        <w:tc>
+          <w:tcPr>
+            <w:tcW w:type="dxa" w:w="3120"/>
+          </w:tcPr>
+          <w:p>
+            <w:pPr>
+              <w:spacing w:line="288" w:lineRule="auto"/>
+            </w:pPr>
+            <w:r>
+              <w:rPr>
+                <w:rFonts w:ascii="微软雅黑" w:hAnsi="微软雅黑" w:eastAsia="微软雅黑"/>
+                <w:b w:val="0"/>
+                <w:sz w:val="20"/>
+              </w:rPr>
+              <w:t>字典数据表</w:t>
+            </w:r>
+          </w:p>
+        </w:tc>
+        <w:tc>
+          <w:tcPr>
+            <w:tcW w:type="dxa" w:w="3120"/>
+          </w:tcPr>
+          <w:p>
+            <w:pPr>
+              <w:spacing w:line="288" w:lineRule="auto"/>
+            </w:pPr>
+            <w:r>
+              <w:rPr>
+                <w:rFonts w:ascii="微软雅黑" w:hAnsi="微软雅黑" w:eastAsia="微软雅黑"/>
+                <w:b w:val="0"/>
+                <w:sz w:val="20"/>
+              </w:rPr>
+              <w:t>dict_type, label, value, color_type</w:t>
             </w:r>
           </w:p>
         </w:tc>
@@ -1994,7 +2490,7 @@
       </w:pPr>
       <w:r>
         <w:rPr>
-          <w:rFonts w:ascii="Calibri" w:hAnsi="Calibri" w:eastAsia="微软雅黑"/>
+          <w:rFonts w:ascii="微软雅黑" w:hAnsi="微软雅黑" w:eastAsia="微软雅黑"/>
           <w:b/>
           <w:sz w:val="24"/>
         </w:rPr>
@@ -2023,7 +2519,7 @@
             </w:pPr>
             <w:r>
               <w:rPr>
-                <w:rFonts w:ascii="Calibri" w:hAnsi="Calibri" w:eastAsia="微软雅黑"/>
+                <w:rFonts w:ascii="微软雅黑" w:hAnsi="微软雅黑" w:eastAsia="微软雅黑"/>
                 <w:b w:val="0"/>
                 <w:sz w:val="20"/>
               </w:rPr>
@@ -2041,7 +2537,7 @@
             </w:pPr>
             <w:r>
               <w:rPr>
-                <w:rFonts w:ascii="Calibri" w:hAnsi="Calibri" w:eastAsia="微软雅黑"/>
+                <w:rFonts w:ascii="微软雅黑" w:hAnsi="微软雅黑" w:eastAsia="微软雅黑"/>
                 <w:b w:val="0"/>
                 <w:sz w:val="20"/>
               </w:rPr>
@@ -2059,7 +2555,7 @@
             </w:pPr>
             <w:r>
               <w:rPr>
-                <w:rFonts w:ascii="Calibri" w:hAnsi="Calibri" w:eastAsia="微软雅黑"/>
+                <w:rFonts w:ascii="微软雅黑" w:hAnsi="微软雅黑" w:eastAsia="微软雅黑"/>
                 <w:b w:val="0"/>
                 <w:sz w:val="20"/>
               </w:rPr>
@@ -2079,7 +2575,7 @@
             </w:pPr>
             <w:r>
               <w:rPr>
-                <w:rFonts w:ascii="Calibri" w:hAnsi="Calibri" w:eastAsia="微软雅黑"/>
+                <w:rFonts w:ascii="微软雅黑" w:hAnsi="微软雅黑" w:eastAsia="微软雅黑"/>
                 <w:b w:val="0"/>
                 <w:sz w:val="20"/>
               </w:rPr>
@@ -2097,7 +2593,7 @@
             </w:pPr>
             <w:r>
               <w:rPr>
-                <w:rFonts w:ascii="Calibri" w:hAnsi="Calibri" w:eastAsia="微软雅黑"/>
+                <w:rFonts w:ascii="微软雅黑" w:hAnsi="微软雅黑" w:eastAsia="微软雅黑"/>
                 <w:b w:val="0"/>
                 <w:sz w:val="20"/>
               </w:rPr>
@@ -2115,7 +2611,7 @@
             </w:pPr>
             <w:r>
               <w:rPr>
-                <w:rFonts w:ascii="Calibri" w:hAnsi="Calibri" w:eastAsia="微软雅黑"/>
+                <w:rFonts w:ascii="微软雅黑" w:hAnsi="微软雅黑" w:eastAsia="微软雅黑"/>
                 <w:b w:val="0"/>
                 <w:sz w:val="20"/>
               </w:rPr>
@@ -2135,7 +2631,119 @@
             </w:pPr>
             <w:r>
               <w:rPr>
-                <w:rFonts w:ascii="Calibri" w:hAnsi="Calibri" w:eastAsia="微软雅黑"/>
+                <w:rFonts w:ascii="微软雅黑" w:hAnsi="微软雅黑" w:eastAsia="微软雅黑"/>
+                <w:b w:val="0"/>
+                <w:sz w:val="20"/>
+              </w:rPr>
+              <w:t>dtlms_teams</w:t>
+            </w:r>
+          </w:p>
+        </w:tc>
+        <w:tc>
+          <w:tcPr>
+            <w:tcW w:type="dxa" w:w="3120"/>
+          </w:tcPr>
+          <w:p>
+            <w:pPr>
+              <w:spacing w:line="288" w:lineRule="auto"/>
+            </w:pPr>
+            <w:r>
+              <w:rPr>
+                <w:rFonts w:ascii="微软雅黑" w:hAnsi="微软雅黑" w:eastAsia="微软雅黑"/>
+                <w:b w:val="0"/>
+                <w:sz w:val="20"/>
+              </w:rPr>
+              <w:t>团队主数据表</w:t>
+            </w:r>
+          </w:p>
+        </w:tc>
+        <w:tc>
+          <w:tcPr>
+            <w:tcW w:type="dxa" w:w="3120"/>
+          </w:tcPr>
+          <w:p>
+            <w:pPr>
+              <w:spacing w:line="288" w:lineRule="auto"/>
+            </w:pPr>
+            <w:r>
+              <w:rPr>
+                <w:rFonts w:ascii="微软雅黑" w:hAnsi="微软雅黑" w:eastAsia="微软雅黑"/>
+                <w:b w:val="0"/>
+                <w:sz w:val="20"/>
+              </w:rPr>
+              <w:t>team_code, team_name, department_name, lead_advisor_id, team_status</w:t>
+            </w:r>
+          </w:p>
+        </w:tc>
+      </w:tr>
+      <w:tr>
+        <w:tc>
+          <w:tcPr>
+            <w:tcW w:type="dxa" w:w="3120"/>
+          </w:tcPr>
+          <w:p>
+            <w:pPr>
+              <w:spacing w:line="288" w:lineRule="auto"/>
+            </w:pPr>
+            <w:r>
+              <w:rPr>
+                <w:rFonts w:ascii="微软雅黑" w:hAnsi="微软雅黑" w:eastAsia="微软雅黑"/>
+                <w:b w:val="0"/>
+                <w:sz w:val="20"/>
+              </w:rPr>
+              <w:t>dtlms_team_advisors</w:t>
+            </w:r>
+          </w:p>
+        </w:tc>
+        <w:tc>
+          <w:tcPr>
+            <w:tcW w:type="dxa" w:w="3120"/>
+          </w:tcPr>
+          <w:p>
+            <w:pPr>
+              <w:spacing w:line="288" w:lineRule="auto"/>
+            </w:pPr>
+            <w:r>
+              <w:rPr>
+                <w:rFonts w:ascii="微软雅黑" w:hAnsi="微软雅黑" w:eastAsia="微软雅黑"/>
+                <w:b w:val="0"/>
+                <w:sz w:val="20"/>
+              </w:rPr>
+              <w:t>团队导师映射表</w:t>
+            </w:r>
+          </w:p>
+        </w:tc>
+        <w:tc>
+          <w:tcPr>
+            <w:tcW w:type="dxa" w:w="3120"/>
+          </w:tcPr>
+          <w:p>
+            <w:pPr>
+              <w:spacing w:line="288" w:lineRule="auto"/>
+            </w:pPr>
+            <w:r>
+              <w:rPr>
+                <w:rFonts w:ascii="微软雅黑" w:hAnsi="微软雅黑" w:eastAsia="微软雅黑"/>
+                <w:b w:val="0"/>
+                <w:sz w:val="20"/>
+              </w:rPr>
+              <w:t>team_id, advisor_id, advisor_role, joined_on, left_on</w:t>
+            </w:r>
+          </w:p>
+        </w:tc>
+      </w:tr>
+      <w:tr>
+        <w:tc>
+          <w:tcPr>
+            <w:tcW w:type="dxa" w:w="3120"/>
+          </w:tcPr>
+          <w:p>
+            <w:pPr>
+              <w:spacing w:line="288" w:lineRule="auto"/>
+            </w:pPr>
+            <w:r>
+              <w:rPr>
+                <w:rFonts w:ascii="微软雅黑" w:hAnsi="微软雅黑" w:eastAsia="微软雅黑"/>
                 <w:b w:val="0"/>
                 <w:sz w:val="20"/>
               </w:rPr>
@@ -2153,7 +2761,7 @@
             </w:pPr>
             <w:r>
               <w:rPr>
-                <w:rFonts w:ascii="Calibri" w:hAnsi="Calibri" w:eastAsia="微软雅黑"/>
+                <w:rFonts w:ascii="微软雅黑" w:hAnsi="微软雅黑" w:eastAsia="微软雅黑"/>
                 <w:b w:val="0"/>
                 <w:sz w:val="20"/>
               </w:rPr>
@@ -2171,11 +2779,11 @@
             </w:pPr>
             <w:r>
               <w:rPr>
-                <w:rFonts w:ascii="Calibri" w:hAnsi="Calibri" w:eastAsia="微软雅黑"/>
+                <w:rFonts w:ascii="微软雅黑" w:hAnsi="微软雅黑" w:eastAsia="微软雅黑"/>
                 <w:b w:val="0"/>
                 <w:sz w:val="20"/>
               </w:rPr>
-              <w:t>student_no, full_name, current_status, primary_advisor_id</w:t>
+              <w:t>student_no, full_name, current_status, team_id, primary_advisor_id</w:t>
             </w:r>
           </w:p>
         </w:tc>
@@ -2191,7 +2799,63 @@
             </w:pPr>
             <w:r>
               <w:rPr>
-                <w:rFonts w:ascii="Calibri" w:hAnsi="Calibri" w:eastAsia="微软雅黑"/>
+                <w:rFonts w:ascii="微软雅黑" w:hAnsi="微软雅黑" w:eastAsia="微软雅黑"/>
+                <w:b w:val="0"/>
+                <w:sz w:val="20"/>
+              </w:rPr>
+              <w:t>dtlms_student_team_history</w:t>
+            </w:r>
+          </w:p>
+        </w:tc>
+        <w:tc>
+          <w:tcPr>
+            <w:tcW w:type="dxa" w:w="3120"/>
+          </w:tcPr>
+          <w:p>
+            <w:pPr>
+              <w:spacing w:line="288" w:lineRule="auto"/>
+            </w:pPr>
+            <w:r>
+              <w:rPr>
+                <w:rFonts w:ascii="微软雅黑" w:hAnsi="微软雅黑" w:eastAsia="微软雅黑"/>
+                <w:b w:val="0"/>
+                <w:sz w:val="20"/>
+              </w:rPr>
+              <w:t>学生团队历史表</w:t>
+            </w:r>
+          </w:p>
+        </w:tc>
+        <w:tc>
+          <w:tcPr>
+            <w:tcW w:type="dxa" w:w="3120"/>
+          </w:tcPr>
+          <w:p>
+            <w:pPr>
+              <w:spacing w:line="288" w:lineRule="auto"/>
+            </w:pPr>
+            <w:r>
+              <w:rPr>
+                <w:rFonts w:ascii="微软雅黑" w:hAnsi="微软雅黑" w:eastAsia="微软雅黑"/>
+                <w:b w:val="0"/>
+                <w:sz w:val="20"/>
+              </w:rPr>
+              <w:t>student_id, team_id, start_date, end_date</w:t>
+            </w:r>
+          </w:p>
+        </w:tc>
+      </w:tr>
+      <w:tr>
+        <w:tc>
+          <w:tcPr>
+            <w:tcW w:type="dxa" w:w="3120"/>
+          </w:tcPr>
+          <w:p>
+            <w:pPr>
+              <w:spacing w:line="288" w:lineRule="auto"/>
+            </w:pPr>
+            <w:r>
+              <w:rPr>
+                <w:rFonts w:ascii="微软雅黑" w:hAnsi="微软雅黑" w:eastAsia="微软雅黑"/>
                 <w:b w:val="0"/>
                 <w:sz w:val="20"/>
               </w:rPr>
@@ -2209,7 +2873,7 @@
             </w:pPr>
             <w:r>
               <w:rPr>
-                <w:rFonts w:ascii="Calibri" w:hAnsi="Calibri" w:eastAsia="微软雅黑"/>
+                <w:rFonts w:ascii="微软雅黑" w:hAnsi="微软雅黑" w:eastAsia="微软雅黑"/>
                 <w:b w:val="0"/>
                 <w:sz w:val="20"/>
               </w:rPr>
@@ -2227,7 +2891,7 @@
             </w:pPr>
             <w:r>
               <w:rPr>
-                <w:rFonts w:ascii="Calibri" w:hAnsi="Calibri" w:eastAsia="微软雅黑"/>
+                <w:rFonts w:ascii="微软雅黑" w:hAnsi="微软雅黑" w:eastAsia="微软雅黑"/>
                 <w:b w:val="0"/>
                 <w:sz w:val="20"/>
               </w:rPr>
@@ -2247,7 +2911,7 @@
             </w:pPr>
             <w:r>
               <w:rPr>
-                <w:rFonts w:ascii="Calibri" w:hAnsi="Calibri" w:eastAsia="微软雅黑"/>
+                <w:rFonts w:ascii="微软雅黑" w:hAnsi="微软雅黑" w:eastAsia="微软雅黑"/>
                 <w:b w:val="0"/>
                 <w:sz w:val="20"/>
               </w:rPr>
@@ -2265,7 +2929,7 @@
             </w:pPr>
             <w:r>
               <w:rPr>
-                <w:rFonts w:ascii="Calibri" w:hAnsi="Calibri" w:eastAsia="微软雅黑"/>
+                <w:rFonts w:ascii="微软雅黑" w:hAnsi="微软雅黑" w:eastAsia="微软雅黑"/>
                 <w:b w:val="0"/>
                 <w:sz w:val="20"/>
               </w:rPr>
@@ -2283,7 +2947,7 @@
             </w:pPr>
             <w:r>
               <w:rPr>
-                <w:rFonts w:ascii="Calibri" w:hAnsi="Calibri" w:eastAsia="微软雅黑"/>
+                <w:rFonts w:ascii="微软雅黑" w:hAnsi="微软雅黑" w:eastAsia="微软雅黑"/>
                 <w:b w:val="0"/>
                 <w:sz w:val="20"/>
               </w:rPr>
@@ -2303,7 +2967,7 @@
             </w:pPr>
             <w:r>
               <w:rPr>
-                <w:rFonts w:ascii="Calibri" w:hAnsi="Calibri" w:eastAsia="微软雅黑"/>
+                <w:rFonts w:ascii="微软雅黑" w:hAnsi="微软雅黑" w:eastAsia="微软雅黑"/>
                 <w:b w:val="0"/>
                 <w:sz w:val="20"/>
               </w:rPr>
@@ -2321,7 +2985,7 @@
             </w:pPr>
             <w:r>
               <w:rPr>
-                <w:rFonts w:ascii="Calibri" w:hAnsi="Calibri" w:eastAsia="微软雅黑"/>
+                <w:rFonts w:ascii="微软雅黑" w:hAnsi="微软雅黑" w:eastAsia="微软雅黑"/>
                 <w:b w:val="0"/>
                 <w:sz w:val="20"/>
               </w:rPr>
@@ -2339,7 +3003,7 @@
             </w:pPr>
             <w:r>
               <w:rPr>
-                <w:rFonts w:ascii="Calibri" w:hAnsi="Calibri" w:eastAsia="微软雅黑"/>
+                <w:rFonts w:ascii="微软雅黑" w:hAnsi="微软雅黑" w:eastAsia="微软雅黑"/>
                 <w:b w:val="0"/>
                 <w:sz w:val="20"/>
               </w:rPr>
@@ -2359,7 +3023,7 @@
             </w:pPr>
             <w:r>
               <w:rPr>
-                <w:rFonts w:ascii="Calibri" w:hAnsi="Calibri" w:eastAsia="微软雅黑"/>
+                <w:rFonts w:ascii="微软雅黑" w:hAnsi="微软雅黑" w:eastAsia="微软雅黑"/>
                 <w:b w:val="0"/>
                 <w:sz w:val="20"/>
               </w:rPr>
@@ -2377,7 +3041,7 @@
             </w:pPr>
             <w:r>
               <w:rPr>
-                <w:rFonts w:ascii="Calibri" w:hAnsi="Calibri" w:eastAsia="微软雅黑"/>
+                <w:rFonts w:ascii="微软雅黑" w:hAnsi="微软雅黑" w:eastAsia="微软雅黑"/>
                 <w:b w:val="0"/>
                 <w:sz w:val="20"/>
               </w:rPr>
@@ -2395,7 +3059,7 @@
             </w:pPr>
             <w:r>
               <w:rPr>
-                <w:rFonts w:ascii="Calibri" w:hAnsi="Calibri" w:eastAsia="微软雅黑"/>
+                <w:rFonts w:ascii="微软雅黑" w:hAnsi="微软雅黑" w:eastAsia="微软雅黑"/>
                 <w:b w:val="0"/>
                 <w:sz w:val="20"/>
               </w:rPr>
@@ -2415,7 +3079,7 @@
             </w:pPr>
             <w:r>
               <w:rPr>
-                <w:rFonts w:ascii="Calibri" w:hAnsi="Calibri" w:eastAsia="微软雅黑"/>
+                <w:rFonts w:ascii="微软雅黑" w:hAnsi="微软雅黑" w:eastAsia="微软雅黑"/>
                 <w:b w:val="0"/>
                 <w:sz w:val="20"/>
               </w:rPr>
@@ -2433,7 +3097,7 @@
             </w:pPr>
             <w:r>
               <w:rPr>
-                <w:rFonts w:ascii="Calibri" w:hAnsi="Calibri" w:eastAsia="微软雅黑"/>
+                <w:rFonts w:ascii="微软雅黑" w:hAnsi="微软雅黑" w:eastAsia="微软雅黑"/>
                 <w:b w:val="0"/>
                 <w:sz w:val="20"/>
               </w:rPr>
@@ -2451,7 +3115,7 @@
             </w:pPr>
             <w:r>
               <w:rPr>
-                <w:rFonts w:ascii="Calibri" w:hAnsi="Calibri" w:eastAsia="微软雅黑"/>
+                <w:rFonts w:ascii="微软雅黑" w:hAnsi="微软雅黑" w:eastAsia="微软雅黑"/>
                 <w:b w:val="0"/>
                 <w:sz w:val="20"/>
               </w:rPr>
@@ -2471,7 +3135,7 @@
             </w:pPr>
             <w:r>
               <w:rPr>
-                <w:rFonts w:ascii="Calibri" w:hAnsi="Calibri" w:eastAsia="微软雅黑"/>
+                <w:rFonts w:ascii="微软雅黑" w:hAnsi="微软雅黑" w:eastAsia="微软雅黑"/>
                 <w:b w:val="0"/>
                 <w:sz w:val="20"/>
               </w:rPr>
@@ -2489,7 +3153,7 @@
             </w:pPr>
             <w:r>
               <w:rPr>
-                <w:rFonts w:ascii="Calibri" w:hAnsi="Calibri" w:eastAsia="微软雅黑"/>
+                <w:rFonts w:ascii="微软雅黑" w:hAnsi="微软雅黑" w:eastAsia="微软雅黑"/>
                 <w:b w:val="0"/>
                 <w:sz w:val="20"/>
               </w:rPr>
@@ -2507,7 +3171,7 @@
             </w:pPr>
             <w:r>
               <w:rPr>
-                <w:rFonts w:ascii="Calibri" w:hAnsi="Calibri" w:eastAsia="微软雅黑"/>
+                <w:rFonts w:ascii="微软雅黑" w:hAnsi="微软雅黑" w:eastAsia="微软雅黑"/>
                 <w:b w:val="0"/>
                 <w:sz w:val="20"/>
               </w:rPr>
@@ -2527,7 +3191,7 @@
             </w:pPr>
             <w:r>
               <w:rPr>
-                <w:rFonts w:ascii="Calibri" w:hAnsi="Calibri" w:eastAsia="微软雅黑"/>
+                <w:rFonts w:ascii="微软雅黑" w:hAnsi="微软雅黑" w:eastAsia="微软雅黑"/>
                 <w:b w:val="0"/>
                 <w:sz w:val="20"/>
               </w:rPr>
@@ -2545,7 +3209,7 @@
             </w:pPr>
             <w:r>
               <w:rPr>
-                <w:rFonts w:ascii="Calibri" w:hAnsi="Calibri" w:eastAsia="微软雅黑"/>
+                <w:rFonts w:ascii="微软雅黑" w:hAnsi="微软雅黑" w:eastAsia="微软雅黑"/>
                 <w:b w:val="0"/>
                 <w:sz w:val="20"/>
               </w:rPr>
@@ -2563,7 +3227,7 @@
             </w:pPr>
             <w:r>
               <w:rPr>
-                <w:rFonts w:ascii="Calibri" w:hAnsi="Calibri" w:eastAsia="微软雅黑"/>
+                <w:rFonts w:ascii="微软雅黑" w:hAnsi="微软雅黑" w:eastAsia="微软雅黑"/>
                 <w:b w:val="0"/>
                 <w:sz w:val="20"/>
               </w:rPr>
@@ -2583,7 +3247,7 @@
             </w:pPr>
             <w:r>
               <w:rPr>
-                <w:rFonts w:ascii="Calibri" w:hAnsi="Calibri" w:eastAsia="微软雅黑"/>
+                <w:rFonts w:ascii="微软雅黑" w:hAnsi="微软雅黑" w:eastAsia="微软雅黑"/>
                 <w:b w:val="0"/>
                 <w:sz w:val="20"/>
               </w:rPr>
@@ -2601,7 +3265,7 @@
             </w:pPr>
             <w:r>
               <w:rPr>
-                <w:rFonts w:ascii="Calibri" w:hAnsi="Calibri" w:eastAsia="微软雅黑"/>
+                <w:rFonts w:ascii="微软雅黑" w:hAnsi="微软雅黑" w:eastAsia="微软雅黑"/>
                 <w:b w:val="0"/>
                 <w:sz w:val="20"/>
               </w:rPr>
@@ -2619,7 +3283,7 @@
             </w:pPr>
             <w:r>
               <w:rPr>
-                <w:rFonts w:ascii="Calibri" w:hAnsi="Calibri" w:eastAsia="微软雅黑"/>
+                <w:rFonts w:ascii="微软雅黑" w:hAnsi="微软雅黑" w:eastAsia="微软雅黑"/>
                 <w:b w:val="0"/>
                 <w:sz w:val="20"/>
               </w:rPr>
@@ -2639,7 +3303,7 @@
             </w:pPr>
             <w:r>
               <w:rPr>
-                <w:rFonts w:ascii="Calibri" w:hAnsi="Calibri" w:eastAsia="微软雅黑"/>
+                <w:rFonts w:ascii="微软雅黑" w:hAnsi="微软雅黑" w:eastAsia="微软雅黑"/>
                 <w:b w:val="0"/>
                 <w:sz w:val="20"/>
               </w:rPr>
@@ -2657,7 +3321,7 @@
             </w:pPr>
             <w:r>
               <w:rPr>
-                <w:rFonts w:ascii="Calibri" w:hAnsi="Calibri" w:eastAsia="微软雅黑"/>
+                <w:rFonts w:ascii="微软雅黑" w:hAnsi="微软雅黑" w:eastAsia="微软雅黑"/>
                 <w:b w:val="0"/>
                 <w:sz w:val="20"/>
               </w:rPr>
@@ -2675,7 +3339,7 @@
             </w:pPr>
             <w:r>
               <w:rPr>
-                <w:rFonts w:ascii="Calibri" w:hAnsi="Calibri" w:eastAsia="微软雅黑"/>
+                <w:rFonts w:ascii="微软雅黑" w:hAnsi="微软雅黑" w:eastAsia="微软雅黑"/>
                 <w:b w:val="0"/>
                 <w:sz w:val="20"/>
               </w:rPr>
@@ -2692,7 +3356,7 @@
       </w:pPr>
       <w:r>
         <w:rPr>
-          <w:rFonts w:ascii="Calibri" w:hAnsi="Calibri" w:eastAsia="微软雅黑"/>
+          <w:rFonts w:ascii="微软雅黑" w:hAnsi="微软雅黑" w:eastAsia="微软雅黑"/>
           <w:b/>
           <w:sz w:val="24"/>
         </w:rPr>
@@ -2721,7 +3385,7 @@
             </w:pPr>
             <w:r>
               <w:rPr>
-                <w:rFonts w:ascii="Calibri" w:hAnsi="Calibri" w:eastAsia="微软雅黑"/>
+                <w:rFonts w:ascii="微软雅黑" w:hAnsi="微软雅黑" w:eastAsia="微软雅黑"/>
                 <w:b w:val="0"/>
                 <w:sz w:val="20"/>
               </w:rPr>
@@ -2739,7 +3403,7 @@
             </w:pPr>
             <w:r>
               <w:rPr>
-                <w:rFonts w:ascii="Calibri" w:hAnsi="Calibri" w:eastAsia="微软雅黑"/>
+                <w:rFonts w:ascii="微软雅黑" w:hAnsi="微软雅黑" w:eastAsia="微软雅黑"/>
                 <w:b w:val="0"/>
                 <w:sz w:val="20"/>
               </w:rPr>
@@ -2757,7 +3421,7 @@
             </w:pPr>
             <w:r>
               <w:rPr>
-                <w:rFonts w:ascii="Calibri" w:hAnsi="Calibri" w:eastAsia="微软雅黑"/>
+                <w:rFonts w:ascii="微软雅黑" w:hAnsi="微软雅黑" w:eastAsia="微软雅黑"/>
                 <w:b w:val="0"/>
                 <w:sz w:val="20"/>
               </w:rPr>
@@ -2777,7 +3441,7 @@
             </w:pPr>
             <w:r>
               <w:rPr>
-                <w:rFonts w:ascii="Calibri" w:hAnsi="Calibri" w:eastAsia="微软雅黑"/>
+                <w:rFonts w:ascii="微软雅黑" w:hAnsi="微软雅黑" w:eastAsia="微软雅黑"/>
                 <w:b w:val="0"/>
                 <w:sz w:val="20"/>
               </w:rPr>
@@ -2795,7 +3459,7 @@
             </w:pPr>
             <w:r>
               <w:rPr>
-                <w:rFonts w:ascii="Calibri" w:hAnsi="Calibri" w:eastAsia="微软雅黑"/>
+                <w:rFonts w:ascii="微软雅黑" w:hAnsi="微软雅黑" w:eastAsia="微软雅黑"/>
                 <w:b w:val="0"/>
                 <w:sz w:val="20"/>
               </w:rPr>
@@ -2813,7 +3477,7 @@
             </w:pPr>
             <w:r>
               <w:rPr>
-                <w:rFonts w:ascii="Calibri" w:hAnsi="Calibri" w:eastAsia="微软雅黑"/>
+                <w:rFonts w:ascii="微软雅黑" w:hAnsi="微软雅黑" w:eastAsia="微软雅黑"/>
                 <w:b w:val="0"/>
                 <w:sz w:val="20"/>
               </w:rPr>
@@ -2833,7 +3497,7 @@
             </w:pPr>
             <w:r>
               <w:rPr>
-                <w:rFonts w:ascii="Calibri" w:hAnsi="Calibri" w:eastAsia="微软雅黑"/>
+                <w:rFonts w:ascii="微软雅黑" w:hAnsi="微软雅黑" w:eastAsia="微软雅黑"/>
                 <w:b w:val="0"/>
                 <w:sz w:val="20"/>
               </w:rPr>
@@ -2851,7 +3515,7 @@
             </w:pPr>
             <w:r>
               <w:rPr>
-                <w:rFonts w:ascii="Calibri" w:hAnsi="Calibri" w:eastAsia="微软雅黑"/>
+                <w:rFonts w:ascii="微软雅黑" w:hAnsi="微软雅黑" w:eastAsia="微软雅黑"/>
                 <w:b w:val="0"/>
                 <w:sz w:val="20"/>
               </w:rPr>
@@ -2869,7 +3533,7 @@
             </w:pPr>
             <w:r>
               <w:rPr>
-                <w:rFonts w:ascii="Calibri" w:hAnsi="Calibri" w:eastAsia="微软雅黑"/>
+                <w:rFonts w:ascii="微软雅黑" w:hAnsi="微软雅黑" w:eastAsia="微软雅黑"/>
                 <w:b w:val="0"/>
                 <w:sz w:val="20"/>
               </w:rPr>
@@ -2889,7 +3553,7 @@
             </w:pPr>
             <w:r>
               <w:rPr>
-                <w:rFonts w:ascii="Calibri" w:hAnsi="Calibri" w:eastAsia="微软雅黑"/>
+                <w:rFonts w:ascii="微软雅黑" w:hAnsi="微软雅黑" w:eastAsia="微软雅黑"/>
                 <w:b w:val="0"/>
                 <w:sz w:val="20"/>
               </w:rPr>
@@ -2907,7 +3571,7 @@
             </w:pPr>
             <w:r>
               <w:rPr>
-                <w:rFonts w:ascii="Calibri" w:hAnsi="Calibri" w:eastAsia="微软雅黑"/>
+                <w:rFonts w:ascii="微软雅黑" w:hAnsi="微软雅黑" w:eastAsia="微软雅黑"/>
                 <w:b w:val="0"/>
                 <w:sz w:val="20"/>
               </w:rPr>
@@ -2925,7 +3589,7 @@
             </w:pPr>
             <w:r>
               <w:rPr>
-                <w:rFonts w:ascii="Calibri" w:hAnsi="Calibri" w:eastAsia="微软雅黑"/>
+                <w:rFonts w:ascii="微软雅黑" w:hAnsi="微软雅黑" w:eastAsia="微软雅黑"/>
                 <w:b w:val="0"/>
                 <w:sz w:val="20"/>
               </w:rPr>
@@ -2945,7 +3609,7 @@
             </w:pPr>
             <w:r>
               <w:rPr>
-                <w:rFonts w:ascii="Calibri" w:hAnsi="Calibri" w:eastAsia="微软雅黑"/>
+                <w:rFonts w:ascii="微软雅黑" w:hAnsi="微软雅黑" w:eastAsia="微软雅黑"/>
                 <w:b w:val="0"/>
                 <w:sz w:val="20"/>
               </w:rPr>
@@ -2963,7 +3627,7 @@
             </w:pPr>
             <w:r>
               <w:rPr>
-                <w:rFonts w:ascii="Calibri" w:hAnsi="Calibri" w:eastAsia="微软雅黑"/>
+                <w:rFonts w:ascii="微软雅黑" w:hAnsi="微软雅黑" w:eastAsia="微软雅黑"/>
                 <w:b w:val="0"/>
                 <w:sz w:val="20"/>
               </w:rPr>
@@ -2981,7 +3645,7 @@
             </w:pPr>
             <w:r>
               <w:rPr>
-                <w:rFonts w:ascii="Calibri" w:hAnsi="Calibri" w:eastAsia="微软雅黑"/>
+                <w:rFonts w:ascii="微软雅黑" w:hAnsi="微软雅黑" w:eastAsia="微软雅黑"/>
                 <w:b w:val="0"/>
                 <w:sz w:val="20"/>
               </w:rPr>
@@ -3001,7 +3665,7 @@
             </w:pPr>
             <w:r>
               <w:rPr>
-                <w:rFonts w:ascii="Calibri" w:hAnsi="Calibri" w:eastAsia="微软雅黑"/>
+                <w:rFonts w:ascii="微软雅黑" w:hAnsi="微软雅黑" w:eastAsia="微软雅黑"/>
                 <w:b w:val="0"/>
                 <w:sz w:val="20"/>
               </w:rPr>
@@ -3019,7 +3683,7 @@
             </w:pPr>
             <w:r>
               <w:rPr>
-                <w:rFonts w:ascii="Calibri" w:hAnsi="Calibri" w:eastAsia="微软雅黑"/>
+                <w:rFonts w:ascii="微软雅黑" w:hAnsi="微软雅黑" w:eastAsia="微软雅黑"/>
                 <w:b w:val="0"/>
                 <w:sz w:val="20"/>
               </w:rPr>
@@ -3037,7 +3701,7 @@
             </w:pPr>
             <w:r>
               <w:rPr>
-                <w:rFonts w:ascii="Calibri" w:hAnsi="Calibri" w:eastAsia="微软雅黑"/>
+                <w:rFonts w:ascii="微软雅黑" w:hAnsi="微软雅黑" w:eastAsia="微软雅黑"/>
                 <w:b w:val="0"/>
                 <w:sz w:val="20"/>
               </w:rPr>
@@ -3057,7 +3721,7 @@
             </w:pPr>
             <w:r>
               <w:rPr>
-                <w:rFonts w:ascii="Calibri" w:hAnsi="Calibri" w:eastAsia="微软雅黑"/>
+                <w:rFonts w:ascii="微软雅黑" w:hAnsi="微软雅黑" w:eastAsia="微软雅黑"/>
                 <w:b w:val="0"/>
                 <w:sz w:val="20"/>
               </w:rPr>
@@ -3075,7 +3739,7 @@
             </w:pPr>
             <w:r>
               <w:rPr>
-                <w:rFonts w:ascii="Calibri" w:hAnsi="Calibri" w:eastAsia="微软雅黑"/>
+                <w:rFonts w:ascii="微软雅黑" w:hAnsi="微软雅黑" w:eastAsia="微软雅黑"/>
                 <w:b w:val="0"/>
                 <w:sz w:val="20"/>
               </w:rPr>
@@ -3093,7 +3757,7 @@
             </w:pPr>
             <w:r>
               <w:rPr>
-                <w:rFonts w:ascii="Calibri" w:hAnsi="Calibri" w:eastAsia="微软雅黑"/>
+                <w:rFonts w:ascii="微软雅黑" w:hAnsi="微软雅黑" w:eastAsia="微软雅黑"/>
                 <w:b w:val="0"/>
                 <w:sz w:val="20"/>
               </w:rPr>
@@ -3113,7 +3777,7 @@
             </w:pPr>
             <w:r>
               <w:rPr>
-                <w:rFonts w:ascii="Calibri" w:hAnsi="Calibri" w:eastAsia="微软雅黑"/>
+                <w:rFonts w:ascii="微软雅黑" w:hAnsi="微软雅黑" w:eastAsia="微软雅黑"/>
                 <w:b w:val="0"/>
                 <w:sz w:val="20"/>
               </w:rPr>
@@ -3131,7 +3795,7 @@
             </w:pPr>
             <w:r>
               <w:rPr>
-                <w:rFonts w:ascii="Calibri" w:hAnsi="Calibri" w:eastAsia="微软雅黑"/>
+                <w:rFonts w:ascii="微软雅黑" w:hAnsi="微软雅黑" w:eastAsia="微软雅黑"/>
                 <w:b w:val="0"/>
                 <w:sz w:val="20"/>
               </w:rPr>
@@ -3149,7 +3813,7 @@
             </w:pPr>
             <w:r>
               <w:rPr>
-                <w:rFonts w:ascii="Calibri" w:hAnsi="Calibri" w:eastAsia="微软雅黑"/>
+                <w:rFonts w:ascii="微软雅黑" w:hAnsi="微软雅黑" w:eastAsia="微软雅黑"/>
                 <w:b w:val="0"/>
                 <w:sz w:val="20"/>
               </w:rPr>
@@ -3169,7 +3833,7 @@
             </w:pPr>
             <w:r>
               <w:rPr>
-                <w:rFonts w:ascii="Calibri" w:hAnsi="Calibri" w:eastAsia="微软雅黑"/>
+                <w:rFonts w:ascii="微软雅黑" w:hAnsi="微软雅黑" w:eastAsia="微软雅黑"/>
                 <w:b w:val="0"/>
                 <w:sz w:val="20"/>
               </w:rPr>
@@ -3187,7 +3851,7 @@
             </w:pPr>
             <w:r>
               <w:rPr>
-                <w:rFonts w:ascii="Calibri" w:hAnsi="Calibri" w:eastAsia="微软雅黑"/>
+                <w:rFonts w:ascii="微软雅黑" w:hAnsi="微软雅黑" w:eastAsia="微软雅黑"/>
                 <w:b w:val="0"/>
                 <w:sz w:val="20"/>
               </w:rPr>
@@ -3205,7 +3869,7 @@
             </w:pPr>
             <w:r>
               <w:rPr>
-                <w:rFonts w:ascii="Calibri" w:hAnsi="Calibri" w:eastAsia="微软雅黑"/>
+                <w:rFonts w:ascii="微软雅黑" w:hAnsi="微软雅黑" w:eastAsia="微软雅黑"/>
                 <w:b w:val="0"/>
                 <w:sz w:val="20"/>
               </w:rPr>
@@ -3225,7 +3889,7 @@
             </w:pPr>
             <w:r>
               <w:rPr>
-                <w:rFonts w:ascii="Calibri" w:hAnsi="Calibri" w:eastAsia="微软雅黑"/>
+                <w:rFonts w:ascii="微软雅黑" w:hAnsi="微软雅黑" w:eastAsia="微软雅黑"/>
                 <w:b w:val="0"/>
                 <w:sz w:val="20"/>
               </w:rPr>
@@ -3243,7 +3907,7 @@
             </w:pPr>
             <w:r>
               <w:rPr>
-                <w:rFonts w:ascii="Calibri" w:hAnsi="Calibri" w:eastAsia="微软雅黑"/>
+                <w:rFonts w:ascii="微软雅黑" w:hAnsi="微软雅黑" w:eastAsia="微软雅黑"/>
                 <w:b w:val="0"/>
                 <w:sz w:val="20"/>
               </w:rPr>
@@ -3261,7 +3925,7 @@
             </w:pPr>
             <w:r>
               <w:rPr>
-                <w:rFonts w:ascii="Calibri" w:hAnsi="Calibri" w:eastAsia="微软雅黑"/>
+                <w:rFonts w:ascii="微软雅黑" w:hAnsi="微软雅黑" w:eastAsia="微软雅黑"/>
                 <w:b w:val="0"/>
                 <w:sz w:val="20"/>
               </w:rPr>
@@ -3281,7 +3945,7 @@
             </w:pPr>
             <w:r>
               <w:rPr>
-                <w:rFonts w:ascii="Calibri" w:hAnsi="Calibri" w:eastAsia="微软雅黑"/>
+                <w:rFonts w:ascii="微软雅黑" w:hAnsi="微软雅黑" w:eastAsia="微软雅黑"/>
                 <w:b w:val="0"/>
                 <w:sz w:val="20"/>
               </w:rPr>
@@ -3299,7 +3963,7 @@
             </w:pPr>
             <w:r>
               <w:rPr>
-                <w:rFonts w:ascii="Calibri" w:hAnsi="Calibri" w:eastAsia="微软雅黑"/>
+                <w:rFonts w:ascii="微软雅黑" w:hAnsi="微软雅黑" w:eastAsia="微软雅黑"/>
                 <w:b w:val="0"/>
                 <w:sz w:val="20"/>
               </w:rPr>
@@ -3317,7 +3981,7 @@
             </w:pPr>
             <w:r>
               <w:rPr>
-                <w:rFonts w:ascii="Calibri" w:hAnsi="Calibri" w:eastAsia="微软雅黑"/>
+                <w:rFonts w:ascii="微软雅黑" w:hAnsi="微软雅黑" w:eastAsia="微软雅黑"/>
                 <w:b w:val="0"/>
                 <w:sz w:val="20"/>
               </w:rPr>
@@ -3337,7 +4001,7 @@
             </w:pPr>
             <w:r>
               <w:rPr>
-                <w:rFonts w:ascii="Calibri" w:hAnsi="Calibri" w:eastAsia="微软雅黑"/>
+                <w:rFonts w:ascii="微软雅黑" w:hAnsi="微软雅黑" w:eastAsia="微软雅黑"/>
                 <w:b w:val="0"/>
                 <w:sz w:val="20"/>
               </w:rPr>
@@ -3355,7 +4019,7 @@
             </w:pPr>
             <w:r>
               <w:rPr>
-                <w:rFonts w:ascii="Calibri" w:hAnsi="Calibri" w:eastAsia="微软雅黑"/>
+                <w:rFonts w:ascii="微软雅黑" w:hAnsi="微软雅黑" w:eastAsia="微软雅黑"/>
                 <w:b w:val="0"/>
                 <w:sz w:val="20"/>
               </w:rPr>
@@ -3373,7 +4037,7 @@
             </w:pPr>
             <w:r>
               <w:rPr>
-                <w:rFonts w:ascii="Calibri" w:hAnsi="Calibri" w:eastAsia="微软雅黑"/>
+                <w:rFonts w:ascii="微软雅黑" w:hAnsi="微软雅黑" w:eastAsia="微软雅黑"/>
                 <w:b w:val="0"/>
                 <w:sz w:val="20"/>
               </w:rPr>
@@ -3393,7 +4057,7 @@
             </w:pPr>
             <w:r>
               <w:rPr>
-                <w:rFonts w:ascii="Calibri" w:hAnsi="Calibri" w:eastAsia="微软雅黑"/>
+                <w:rFonts w:ascii="微软雅黑" w:hAnsi="微软雅黑" w:eastAsia="微软雅黑"/>
                 <w:b w:val="0"/>
                 <w:sz w:val="20"/>
               </w:rPr>
@@ -3411,7 +4075,7 @@
             </w:pPr>
             <w:r>
               <w:rPr>
-                <w:rFonts w:ascii="Calibri" w:hAnsi="Calibri" w:eastAsia="微软雅黑"/>
+                <w:rFonts w:ascii="微软雅黑" w:hAnsi="微软雅黑" w:eastAsia="微软雅黑"/>
                 <w:b w:val="0"/>
                 <w:sz w:val="20"/>
               </w:rPr>
@@ -3429,7 +4093,7 @@
             </w:pPr>
             <w:r>
               <w:rPr>
-                <w:rFonts w:ascii="Calibri" w:hAnsi="Calibri" w:eastAsia="微软雅黑"/>
+                <w:rFonts w:ascii="微软雅黑" w:hAnsi="微软雅黑" w:eastAsia="微软雅黑"/>
                 <w:b w:val="0"/>
                 <w:sz w:val="20"/>
               </w:rPr>
@@ -3446,7 +4110,1041 @@
       </w:pPr>
       <w:r>
         <w:rPr>
-          <w:rFonts w:ascii="Calibri" w:hAnsi="Calibri" w:eastAsia="微软雅黑"/>
+          <w:rFonts w:ascii="微软雅黑" w:hAnsi="微软雅黑" w:eastAsia="微软雅黑"/>
+          <w:b/>
+          <w:sz w:val="24"/>
+        </w:rPr>
+        <w:t>运行态镜像与同步类表</w:t>
+      </w:r>
+    </w:p>
+    <w:tbl>
+      <w:tblPr>
+        <w:tblStyle w:val="TableGrid"/>
+        <w:tblW w:type="auto" w:w="0"/>
+        <w:tblLook w:firstColumn="1" w:firstRow="1" w:lastColumn="0" w:lastRow="0" w:noHBand="0" w:noVBand="1" w:val="04A0"/>
+      </w:tblPr>
+      <w:tblGrid>
+        <w:gridCol w:w="3120"/>
+        <w:gridCol w:w="3120"/>
+        <w:gridCol w:w="3120"/>
+      </w:tblGrid>
+      <w:tr>
+        <w:tc>
+          <w:tcPr>
+            <w:tcW w:type="dxa" w:w="3120"/>
+          </w:tcPr>
+          <w:p>
+            <w:pPr>
+              <w:spacing w:line="288" w:lineRule="auto"/>
+            </w:pPr>
+            <w:r>
+              <w:rPr>
+                <w:rFonts w:ascii="微软雅黑" w:hAnsi="微软雅黑" w:eastAsia="微软雅黑"/>
+                <w:b w:val="0"/>
+                <w:sz w:val="20"/>
+              </w:rPr>
+              <w:t>表名</w:t>
+            </w:r>
+          </w:p>
+        </w:tc>
+        <w:tc>
+          <w:tcPr>
+            <w:tcW w:type="dxa" w:w="3120"/>
+          </w:tcPr>
+          <w:p>
+            <w:pPr>
+              <w:spacing w:line="288" w:lineRule="auto"/>
+            </w:pPr>
+            <w:r>
+              <w:rPr>
+                <w:rFonts w:ascii="微软雅黑" w:hAnsi="微软雅黑" w:eastAsia="微软雅黑"/>
+                <w:b w:val="0"/>
+                <w:sz w:val="20"/>
+              </w:rPr>
+              <w:t>用途</w:t>
+            </w:r>
+          </w:p>
+        </w:tc>
+        <w:tc>
+          <w:tcPr>
+            <w:tcW w:type="dxa" w:w="3120"/>
+          </w:tcPr>
+          <w:p>
+            <w:pPr>
+              <w:spacing w:line="288" w:lineRule="auto"/>
+            </w:pPr>
+            <w:r>
+              <w:rPr>
+                <w:rFonts w:ascii="微软雅黑" w:hAnsi="微软雅黑" w:eastAsia="微软雅黑"/>
+                <w:b w:val="0"/>
+                <w:sz w:val="20"/>
+              </w:rPr>
+              <w:t>关键字段</w:t>
+            </w:r>
+          </w:p>
+        </w:tc>
+      </w:tr>
+      <w:tr>
+        <w:tc>
+          <w:tcPr>
+            <w:tcW w:type="dxa" w:w="3120"/>
+          </w:tcPr>
+          <w:p>
+            <w:pPr>
+              <w:spacing w:line="288" w:lineRule="auto"/>
+            </w:pPr>
+            <w:r>
+              <w:rPr>
+                <w:rFonts w:ascii="微软雅黑" w:hAnsi="微软雅黑" w:eastAsia="微软雅黑"/>
+                <w:b w:val="0"/>
+                <w:sz w:val="20"/>
+              </w:rPr>
+              <w:t>dtlms_runtime_counters</w:t>
+            </w:r>
+          </w:p>
+        </w:tc>
+        <w:tc>
+          <w:tcPr>
+            <w:tcW w:type="dxa" w:w="3120"/>
+          </w:tcPr>
+          <w:p>
+            <w:pPr>
+              <w:spacing w:line="288" w:lineRule="auto"/>
+            </w:pPr>
+            <w:r>
+              <w:rPr>
+                <w:rFonts w:ascii="微软雅黑" w:hAnsi="微软雅黑" w:eastAsia="微软雅黑"/>
+                <w:b w:val="0"/>
+                <w:sz w:val="20"/>
+              </w:rPr>
+              <w:t>运行态计数器表</w:t>
+            </w:r>
+          </w:p>
+        </w:tc>
+        <w:tc>
+          <w:tcPr>
+            <w:tcW w:type="dxa" w:w="3120"/>
+          </w:tcPr>
+          <w:p>
+            <w:pPr>
+              <w:spacing w:line="288" w:lineRule="auto"/>
+            </w:pPr>
+            <w:r>
+              <w:rPr>
+                <w:rFonts w:ascii="微软雅黑" w:hAnsi="微软雅黑" w:eastAsia="微软雅黑"/>
+                <w:b w:val="0"/>
+                <w:sz w:val="20"/>
+              </w:rPr>
+              <w:t>counter_name, counter_value</w:t>
+            </w:r>
+          </w:p>
+        </w:tc>
+      </w:tr>
+      <w:tr>
+        <w:tc>
+          <w:tcPr>
+            <w:tcW w:type="dxa" w:w="3120"/>
+          </w:tcPr>
+          <w:p>
+            <w:pPr>
+              <w:spacing w:line="288" w:lineRule="auto"/>
+            </w:pPr>
+            <w:r>
+              <w:rPr>
+                <w:rFonts w:ascii="微软雅黑" w:hAnsi="微软雅黑" w:eastAsia="微软雅黑"/>
+                <w:b w:val="0"/>
+                <w:sz w:val="20"/>
+              </w:rPr>
+              <w:t>dtlms_runtime_profiles</w:t>
+            </w:r>
+          </w:p>
+        </w:tc>
+        <w:tc>
+          <w:tcPr>
+            <w:tcW w:type="dxa" w:w="3120"/>
+          </w:tcPr>
+          <w:p>
+            <w:pPr>
+              <w:spacing w:line="288" w:lineRule="auto"/>
+            </w:pPr>
+            <w:r>
+              <w:rPr>
+                <w:rFonts w:ascii="微软雅黑" w:hAnsi="微软雅黑" w:eastAsia="微软雅黑"/>
+                <w:b w:val="0"/>
+                <w:sz w:val="20"/>
+              </w:rPr>
+              <w:t>运行态个人资料表</w:t>
+            </w:r>
+          </w:p>
+        </w:tc>
+        <w:tc>
+          <w:tcPr>
+            <w:tcW w:type="dxa" w:w="3120"/>
+          </w:tcPr>
+          <w:p>
+            <w:pPr>
+              <w:spacing w:line="288" w:lineRule="auto"/>
+            </w:pPr>
+            <w:r>
+              <w:rPr>
+                <w:rFonts w:ascii="微软雅黑" w:hAnsi="微软雅黑" w:eastAsia="微软雅黑"/>
+                <w:b w:val="0"/>
+                <w:sz w:val="20"/>
+              </w:rPr>
+              <w:t>username, payload</w:t>
+            </w:r>
+          </w:p>
+        </w:tc>
+      </w:tr>
+      <w:tr>
+        <w:tc>
+          <w:tcPr>
+            <w:tcW w:type="dxa" w:w="3120"/>
+          </w:tcPr>
+          <w:p>
+            <w:pPr>
+              <w:spacing w:line="288" w:lineRule="auto"/>
+            </w:pPr>
+            <w:r>
+              <w:rPr>
+                <w:rFonts w:ascii="微软雅黑" w:hAnsi="微软雅黑" w:eastAsia="微软雅黑"/>
+                <w:b w:val="0"/>
+                <w:sz w:val="20"/>
+              </w:rPr>
+              <w:t>dtlms_runtime_students</w:t>
+            </w:r>
+          </w:p>
+        </w:tc>
+        <w:tc>
+          <w:tcPr>
+            <w:tcW w:type="dxa" w:w="3120"/>
+          </w:tcPr>
+          <w:p>
+            <w:pPr>
+              <w:spacing w:line="288" w:lineRule="auto"/>
+            </w:pPr>
+            <w:r>
+              <w:rPr>
+                <w:rFonts w:ascii="微软雅黑" w:hAnsi="微软雅黑" w:eastAsia="微软雅黑"/>
+                <w:b w:val="0"/>
+                <w:sz w:val="20"/>
+              </w:rPr>
+              <w:t>运行态学生镜像表</w:t>
+            </w:r>
+          </w:p>
+        </w:tc>
+        <w:tc>
+          <w:tcPr>
+            <w:tcW w:type="dxa" w:w="3120"/>
+          </w:tcPr>
+          <w:p>
+            <w:pPr>
+              <w:spacing w:line="288" w:lineRule="auto"/>
+            </w:pPr>
+            <w:r>
+              <w:rPr>
+                <w:rFonts w:ascii="微软雅黑" w:hAnsi="微软雅黑" w:eastAsia="微软雅黑"/>
+                <w:b w:val="0"/>
+                <w:sz w:val="20"/>
+              </w:rPr>
+              <w:t>id, payload</w:t>
+            </w:r>
+          </w:p>
+        </w:tc>
+      </w:tr>
+      <w:tr>
+        <w:tc>
+          <w:tcPr>
+            <w:tcW w:type="dxa" w:w="3120"/>
+          </w:tcPr>
+          <w:p>
+            <w:pPr>
+              <w:spacing w:line="288" w:lineRule="auto"/>
+            </w:pPr>
+            <w:r>
+              <w:rPr>
+                <w:rFonts w:ascii="微软雅黑" w:hAnsi="微软雅黑" w:eastAsia="微软雅黑"/>
+                <w:b w:val="0"/>
+                <w:sz w:val="20"/>
+              </w:rPr>
+              <w:t>dtlms_runtime_recruitment_plans</w:t>
+            </w:r>
+          </w:p>
+        </w:tc>
+        <w:tc>
+          <w:tcPr>
+            <w:tcW w:type="dxa" w:w="3120"/>
+          </w:tcPr>
+          <w:p>
+            <w:pPr>
+              <w:spacing w:line="288" w:lineRule="auto"/>
+            </w:pPr>
+            <w:r>
+              <w:rPr>
+                <w:rFonts w:ascii="微软雅黑" w:hAnsi="微软雅黑" w:eastAsia="微软雅黑"/>
+                <w:b w:val="0"/>
+                <w:sz w:val="20"/>
+              </w:rPr>
+              <w:t>运行态招生计划镜像表</w:t>
+            </w:r>
+          </w:p>
+        </w:tc>
+        <w:tc>
+          <w:tcPr>
+            <w:tcW w:type="dxa" w:w="3120"/>
+          </w:tcPr>
+          <w:p>
+            <w:pPr>
+              <w:spacing w:line="288" w:lineRule="auto"/>
+            </w:pPr>
+            <w:r>
+              <w:rPr>
+                <w:rFonts w:ascii="微软雅黑" w:hAnsi="微软雅黑" w:eastAsia="微软雅黑"/>
+                <w:b w:val="0"/>
+                <w:sz w:val="20"/>
+              </w:rPr>
+              <w:t>id, payload</w:t>
+            </w:r>
+          </w:p>
+        </w:tc>
+      </w:tr>
+      <w:tr>
+        <w:tc>
+          <w:tcPr>
+            <w:tcW w:type="dxa" w:w="3120"/>
+          </w:tcPr>
+          <w:p>
+            <w:pPr>
+              <w:spacing w:line="288" w:lineRule="auto"/>
+            </w:pPr>
+            <w:r>
+              <w:rPr>
+                <w:rFonts w:ascii="微软雅黑" w:hAnsi="微软雅黑" w:eastAsia="微软雅黑"/>
+                <w:b w:val="0"/>
+                <w:sz w:val="20"/>
+              </w:rPr>
+              <w:t>dtlms_runtime_recruitment_applications</w:t>
+            </w:r>
+          </w:p>
+        </w:tc>
+        <w:tc>
+          <w:tcPr>
+            <w:tcW w:type="dxa" w:w="3120"/>
+          </w:tcPr>
+          <w:p>
+            <w:pPr>
+              <w:spacing w:line="288" w:lineRule="auto"/>
+            </w:pPr>
+            <w:r>
+              <w:rPr>
+                <w:rFonts w:ascii="微软雅黑" w:hAnsi="微软雅黑" w:eastAsia="微软雅黑"/>
+                <w:b w:val="0"/>
+                <w:sz w:val="20"/>
+              </w:rPr>
+              <w:t>运行态申请镜像表</w:t>
+            </w:r>
+          </w:p>
+        </w:tc>
+        <w:tc>
+          <w:tcPr>
+            <w:tcW w:type="dxa" w:w="3120"/>
+          </w:tcPr>
+          <w:p>
+            <w:pPr>
+              <w:spacing w:line="288" w:lineRule="auto"/>
+            </w:pPr>
+            <w:r>
+              <w:rPr>
+                <w:rFonts w:ascii="微软雅黑" w:hAnsi="微软雅黑" w:eastAsia="微软雅黑"/>
+                <w:b w:val="0"/>
+                <w:sz w:val="20"/>
+              </w:rPr>
+              <w:t>id, payload</w:t>
+            </w:r>
+          </w:p>
+        </w:tc>
+      </w:tr>
+      <w:tr>
+        <w:tc>
+          <w:tcPr>
+            <w:tcW w:type="dxa" w:w="3120"/>
+          </w:tcPr>
+          <w:p>
+            <w:pPr>
+              <w:spacing w:line="288" w:lineRule="auto"/>
+            </w:pPr>
+            <w:r>
+              <w:rPr>
+                <w:rFonts w:ascii="微软雅黑" w:hAnsi="微软雅黑" w:eastAsia="微软雅黑"/>
+                <w:b w:val="0"/>
+                <w:sz w:val="20"/>
+              </w:rPr>
+              <w:t>dtlms_runtime_training_plans</w:t>
+            </w:r>
+          </w:p>
+        </w:tc>
+        <w:tc>
+          <w:tcPr>
+            <w:tcW w:type="dxa" w:w="3120"/>
+          </w:tcPr>
+          <w:p>
+            <w:pPr>
+              <w:spacing w:line="288" w:lineRule="auto"/>
+            </w:pPr>
+            <w:r>
+              <w:rPr>
+                <w:rFonts w:ascii="微软雅黑" w:hAnsi="微软雅黑" w:eastAsia="微软雅黑"/>
+                <w:b w:val="0"/>
+                <w:sz w:val="20"/>
+              </w:rPr>
+              <w:t>运行态培养方案镜像表</w:t>
+            </w:r>
+          </w:p>
+        </w:tc>
+        <w:tc>
+          <w:tcPr>
+            <w:tcW w:type="dxa" w:w="3120"/>
+          </w:tcPr>
+          <w:p>
+            <w:pPr>
+              <w:spacing w:line="288" w:lineRule="auto"/>
+            </w:pPr>
+            <w:r>
+              <w:rPr>
+                <w:rFonts w:ascii="微软雅黑" w:hAnsi="微软雅黑" w:eastAsia="微软雅黑"/>
+                <w:b w:val="0"/>
+                <w:sz w:val="20"/>
+              </w:rPr>
+              <w:t>id, payload</w:t>
+            </w:r>
+          </w:p>
+        </w:tc>
+      </w:tr>
+      <w:tr>
+        <w:tc>
+          <w:tcPr>
+            <w:tcW w:type="dxa" w:w="3120"/>
+          </w:tcPr>
+          <w:p>
+            <w:pPr>
+              <w:spacing w:line="288" w:lineRule="auto"/>
+            </w:pPr>
+            <w:r>
+              <w:rPr>
+                <w:rFonts w:ascii="微软雅黑" w:hAnsi="微软雅黑" w:eastAsia="微软雅黑"/>
+                <w:b w:val="0"/>
+                <w:sz w:val="20"/>
+              </w:rPr>
+              <w:t>dtlms_runtime_scientific_reports</w:t>
+            </w:r>
+          </w:p>
+        </w:tc>
+        <w:tc>
+          <w:tcPr>
+            <w:tcW w:type="dxa" w:w="3120"/>
+          </w:tcPr>
+          <w:p>
+            <w:pPr>
+              <w:spacing w:line="288" w:lineRule="auto"/>
+            </w:pPr>
+            <w:r>
+              <w:rPr>
+                <w:rFonts w:ascii="微软雅黑" w:hAnsi="微软雅黑" w:eastAsia="微软雅黑"/>
+                <w:b w:val="0"/>
+                <w:sz w:val="20"/>
+              </w:rPr>
+              <w:t>运行态科研报告镜像表</w:t>
+            </w:r>
+          </w:p>
+        </w:tc>
+        <w:tc>
+          <w:tcPr>
+            <w:tcW w:type="dxa" w:w="3120"/>
+          </w:tcPr>
+          <w:p>
+            <w:pPr>
+              <w:spacing w:line="288" w:lineRule="auto"/>
+            </w:pPr>
+            <w:r>
+              <w:rPr>
+                <w:rFonts w:ascii="微软雅黑" w:hAnsi="微软雅黑" w:eastAsia="微软雅黑"/>
+                <w:b w:val="0"/>
+                <w:sz w:val="20"/>
+              </w:rPr>
+              <w:t>id, payload</w:t>
+            </w:r>
+          </w:p>
+        </w:tc>
+      </w:tr>
+      <w:tr>
+        <w:tc>
+          <w:tcPr>
+            <w:tcW w:type="dxa" w:w="3120"/>
+          </w:tcPr>
+          <w:p>
+            <w:pPr>
+              <w:spacing w:line="288" w:lineRule="auto"/>
+            </w:pPr>
+            <w:r>
+              <w:rPr>
+                <w:rFonts w:ascii="微软雅黑" w:hAnsi="微软雅黑" w:eastAsia="微软雅黑"/>
+                <w:b w:val="0"/>
+                <w:sz w:val="20"/>
+              </w:rPr>
+              <w:t>dtlms_runtime_outbound_studies</w:t>
+            </w:r>
+          </w:p>
+        </w:tc>
+        <w:tc>
+          <w:tcPr>
+            <w:tcW w:type="dxa" w:w="3120"/>
+          </w:tcPr>
+          <w:p>
+            <w:pPr>
+              <w:spacing w:line="288" w:lineRule="auto"/>
+            </w:pPr>
+            <w:r>
+              <w:rPr>
+                <w:rFonts w:ascii="微软雅黑" w:hAnsi="微软雅黑" w:eastAsia="微软雅黑"/>
+                <w:b w:val="0"/>
+                <w:sz w:val="20"/>
+              </w:rPr>
+              <w:t>运行态外出研修镜像表</w:t>
+            </w:r>
+          </w:p>
+        </w:tc>
+        <w:tc>
+          <w:tcPr>
+            <w:tcW w:type="dxa" w:w="3120"/>
+          </w:tcPr>
+          <w:p>
+            <w:pPr>
+              <w:spacing w:line="288" w:lineRule="auto"/>
+            </w:pPr>
+            <w:r>
+              <w:rPr>
+                <w:rFonts w:ascii="微软雅黑" w:hAnsi="微软雅黑" w:eastAsia="微软雅黑"/>
+                <w:b w:val="0"/>
+                <w:sz w:val="20"/>
+              </w:rPr>
+              <w:t>id, payload</w:t>
+            </w:r>
+          </w:p>
+        </w:tc>
+      </w:tr>
+      <w:tr>
+        <w:tc>
+          <w:tcPr>
+            <w:tcW w:type="dxa" w:w="3120"/>
+          </w:tcPr>
+          <w:p>
+            <w:pPr>
+              <w:spacing w:line="288" w:lineRule="auto"/>
+            </w:pPr>
+            <w:r>
+              <w:rPr>
+                <w:rFonts w:ascii="微软雅黑" w:hAnsi="微软雅黑" w:eastAsia="微软雅黑"/>
+                <w:b w:val="0"/>
+                <w:sz w:val="20"/>
+              </w:rPr>
+              <w:t>dtlms_runtime_theses</w:t>
+            </w:r>
+          </w:p>
+        </w:tc>
+        <w:tc>
+          <w:tcPr>
+            <w:tcW w:type="dxa" w:w="3120"/>
+          </w:tcPr>
+          <w:p>
+            <w:pPr>
+              <w:spacing w:line="288" w:lineRule="auto"/>
+            </w:pPr>
+            <w:r>
+              <w:rPr>
+                <w:rFonts w:ascii="微软雅黑" w:hAnsi="微软雅黑" w:eastAsia="微软雅黑"/>
+                <w:b w:val="0"/>
+                <w:sz w:val="20"/>
+              </w:rPr>
+              <w:t>运行态论文镜像表</w:t>
+            </w:r>
+          </w:p>
+        </w:tc>
+        <w:tc>
+          <w:tcPr>
+            <w:tcW w:type="dxa" w:w="3120"/>
+          </w:tcPr>
+          <w:p>
+            <w:pPr>
+              <w:spacing w:line="288" w:lineRule="auto"/>
+            </w:pPr>
+            <w:r>
+              <w:rPr>
+                <w:rFonts w:ascii="微软雅黑" w:hAnsi="微软雅黑" w:eastAsia="微软雅黑"/>
+                <w:b w:val="0"/>
+                <w:sz w:val="20"/>
+              </w:rPr>
+              <w:t>id, payload</w:t>
+            </w:r>
+          </w:p>
+        </w:tc>
+      </w:tr>
+      <w:tr>
+        <w:tc>
+          <w:tcPr>
+            <w:tcW w:type="dxa" w:w="3120"/>
+          </w:tcPr>
+          <w:p>
+            <w:pPr>
+              <w:spacing w:line="288" w:lineRule="auto"/>
+            </w:pPr>
+            <w:r>
+              <w:rPr>
+                <w:rFonts w:ascii="微软雅黑" w:hAnsi="微软雅黑" w:eastAsia="微软雅黑"/>
+                <w:b w:val="0"/>
+                <w:sz w:val="20"/>
+              </w:rPr>
+              <w:t>dtlms_runtime_thesis_reviews</w:t>
+            </w:r>
+          </w:p>
+        </w:tc>
+        <w:tc>
+          <w:tcPr>
+            <w:tcW w:type="dxa" w:w="3120"/>
+          </w:tcPr>
+          <w:p>
+            <w:pPr>
+              <w:spacing w:line="288" w:lineRule="auto"/>
+            </w:pPr>
+            <w:r>
+              <w:rPr>
+                <w:rFonts w:ascii="微软雅黑" w:hAnsi="微软雅黑" w:eastAsia="微软雅黑"/>
+                <w:b w:val="0"/>
+                <w:sz w:val="20"/>
+              </w:rPr>
+              <w:t>运行态盲审镜像表</w:t>
+            </w:r>
+          </w:p>
+        </w:tc>
+        <w:tc>
+          <w:tcPr>
+            <w:tcW w:type="dxa" w:w="3120"/>
+          </w:tcPr>
+          <w:p>
+            <w:pPr>
+              <w:spacing w:line="288" w:lineRule="auto"/>
+            </w:pPr>
+            <w:r>
+              <w:rPr>
+                <w:rFonts w:ascii="微软雅黑" w:hAnsi="微软雅黑" w:eastAsia="微软雅黑"/>
+                <w:b w:val="0"/>
+                <w:sz w:val="20"/>
+              </w:rPr>
+              <w:t>id, payload</w:t>
+            </w:r>
+          </w:p>
+        </w:tc>
+      </w:tr>
+      <w:tr>
+        <w:tc>
+          <w:tcPr>
+            <w:tcW w:type="dxa" w:w="3120"/>
+          </w:tcPr>
+          <w:p>
+            <w:pPr>
+              <w:spacing w:line="288" w:lineRule="auto"/>
+            </w:pPr>
+            <w:r>
+              <w:rPr>
+                <w:rFonts w:ascii="微软雅黑" w:hAnsi="微软雅黑" w:eastAsia="微软雅黑"/>
+                <w:b w:val="0"/>
+                <w:sz w:val="20"/>
+              </w:rPr>
+              <w:t>dtlms_runtime_roles</w:t>
+            </w:r>
+          </w:p>
+        </w:tc>
+        <w:tc>
+          <w:tcPr>
+            <w:tcW w:type="dxa" w:w="3120"/>
+          </w:tcPr>
+          <w:p>
+            <w:pPr>
+              <w:spacing w:line="288" w:lineRule="auto"/>
+            </w:pPr>
+            <w:r>
+              <w:rPr>
+                <w:rFonts w:ascii="微软雅黑" w:hAnsi="微软雅黑" w:eastAsia="微软雅黑"/>
+                <w:b w:val="0"/>
+                <w:sz w:val="20"/>
+              </w:rPr>
+              <w:t>运行态角色镜像表</w:t>
+            </w:r>
+          </w:p>
+        </w:tc>
+        <w:tc>
+          <w:tcPr>
+            <w:tcW w:type="dxa" w:w="3120"/>
+          </w:tcPr>
+          <w:p>
+            <w:pPr>
+              <w:spacing w:line="288" w:lineRule="auto"/>
+            </w:pPr>
+            <w:r>
+              <w:rPr>
+                <w:rFonts w:ascii="微软雅黑" w:hAnsi="微软雅黑" w:eastAsia="微软雅黑"/>
+                <w:b w:val="0"/>
+                <w:sz w:val="20"/>
+              </w:rPr>
+              <w:t>id, payload</w:t>
+            </w:r>
+          </w:p>
+        </w:tc>
+      </w:tr>
+      <w:tr>
+        <w:tc>
+          <w:tcPr>
+            <w:tcW w:type="dxa" w:w="3120"/>
+          </w:tcPr>
+          <w:p>
+            <w:pPr>
+              <w:spacing w:line="288" w:lineRule="auto"/>
+            </w:pPr>
+            <w:r>
+              <w:rPr>
+                <w:rFonts w:ascii="微软雅黑" w:hAnsi="微软雅黑" w:eastAsia="微软雅黑"/>
+                <w:b w:val="0"/>
+                <w:sz w:val="20"/>
+              </w:rPr>
+              <w:t>dtlms_runtime_system_users</w:t>
+            </w:r>
+          </w:p>
+        </w:tc>
+        <w:tc>
+          <w:tcPr>
+            <w:tcW w:type="dxa" w:w="3120"/>
+          </w:tcPr>
+          <w:p>
+            <w:pPr>
+              <w:spacing w:line="288" w:lineRule="auto"/>
+            </w:pPr>
+            <w:r>
+              <w:rPr>
+                <w:rFonts w:ascii="微软雅黑" w:hAnsi="微软雅黑" w:eastAsia="微软雅黑"/>
+                <w:b w:val="0"/>
+                <w:sz w:val="20"/>
+              </w:rPr>
+              <w:t>运行态系统用户镜像表</w:t>
+            </w:r>
+          </w:p>
+        </w:tc>
+        <w:tc>
+          <w:tcPr>
+            <w:tcW w:type="dxa" w:w="3120"/>
+          </w:tcPr>
+          <w:p>
+            <w:pPr>
+              <w:spacing w:line="288" w:lineRule="auto"/>
+            </w:pPr>
+            <w:r>
+              <w:rPr>
+                <w:rFonts w:ascii="微软雅黑" w:hAnsi="微软雅黑" w:eastAsia="微软雅黑"/>
+                <w:b w:val="0"/>
+                <w:sz w:val="20"/>
+              </w:rPr>
+              <w:t>id, payload</w:t>
+            </w:r>
+          </w:p>
+        </w:tc>
+      </w:tr>
+      <w:tr>
+        <w:tc>
+          <w:tcPr>
+            <w:tcW w:type="dxa" w:w="3120"/>
+          </w:tcPr>
+          <w:p>
+            <w:pPr>
+              <w:spacing w:line="288" w:lineRule="auto"/>
+            </w:pPr>
+            <w:r>
+              <w:rPr>
+                <w:rFonts w:ascii="微软雅黑" w:hAnsi="微软雅黑" w:eastAsia="微软雅黑"/>
+                <w:b w:val="0"/>
+                <w:sz w:val="20"/>
+              </w:rPr>
+              <w:t>dtlms_runtime_audit_policies</w:t>
+            </w:r>
+          </w:p>
+        </w:tc>
+        <w:tc>
+          <w:tcPr>
+            <w:tcW w:type="dxa" w:w="3120"/>
+          </w:tcPr>
+          <w:p>
+            <w:pPr>
+              <w:spacing w:line="288" w:lineRule="auto"/>
+            </w:pPr>
+            <w:r>
+              <w:rPr>
+                <w:rFonts w:ascii="微软雅黑" w:hAnsi="微软雅黑" w:eastAsia="微软雅黑"/>
+                <w:b w:val="0"/>
+                <w:sz w:val="20"/>
+              </w:rPr>
+              <w:t>运行态审计策略镜像表</w:t>
+            </w:r>
+          </w:p>
+        </w:tc>
+        <w:tc>
+          <w:tcPr>
+            <w:tcW w:type="dxa" w:w="3120"/>
+          </w:tcPr>
+          <w:p>
+            <w:pPr>
+              <w:spacing w:line="288" w:lineRule="auto"/>
+            </w:pPr>
+            <w:r>
+              <w:rPr>
+                <w:rFonts w:ascii="微软雅黑" w:hAnsi="微软雅黑" w:eastAsia="微软雅黑"/>
+                <w:b w:val="0"/>
+                <w:sz w:val="20"/>
+              </w:rPr>
+              <w:t>id, payload</w:t>
+            </w:r>
+          </w:p>
+        </w:tc>
+      </w:tr>
+      <w:tr>
+        <w:tc>
+          <w:tcPr>
+            <w:tcW w:type="dxa" w:w="3120"/>
+          </w:tcPr>
+          <w:p>
+            <w:pPr>
+              <w:spacing w:line="288" w:lineRule="auto"/>
+            </w:pPr>
+            <w:r>
+              <w:rPr>
+                <w:rFonts w:ascii="微软雅黑" w:hAnsi="微软雅黑" w:eastAsia="微软雅黑"/>
+                <w:b w:val="0"/>
+                <w:sz w:val="20"/>
+              </w:rPr>
+              <w:t>dtlms_runtime_integrations</w:t>
+            </w:r>
+          </w:p>
+        </w:tc>
+        <w:tc>
+          <w:tcPr>
+            <w:tcW w:type="dxa" w:w="3120"/>
+          </w:tcPr>
+          <w:p>
+            <w:pPr>
+              <w:spacing w:line="288" w:lineRule="auto"/>
+            </w:pPr>
+            <w:r>
+              <w:rPr>
+                <w:rFonts w:ascii="微软雅黑" w:hAnsi="微软雅黑" w:eastAsia="微软雅黑"/>
+                <w:b w:val="0"/>
+                <w:sz w:val="20"/>
+              </w:rPr>
+              <w:t>运行态集成链路镜像表</w:t>
+            </w:r>
+          </w:p>
+        </w:tc>
+        <w:tc>
+          <w:tcPr>
+            <w:tcW w:type="dxa" w:w="3120"/>
+          </w:tcPr>
+          <w:p>
+            <w:pPr>
+              <w:spacing w:line="288" w:lineRule="auto"/>
+            </w:pPr>
+            <w:r>
+              <w:rPr>
+                <w:rFonts w:ascii="微软雅黑" w:hAnsi="微软雅黑" w:eastAsia="微软雅黑"/>
+                <w:b w:val="0"/>
+                <w:sz w:val="20"/>
+              </w:rPr>
+              <w:t>id, payload</w:t>
+            </w:r>
+          </w:p>
+        </w:tc>
+      </w:tr>
+      <w:tr>
+        <w:tc>
+          <w:tcPr>
+            <w:tcW w:type="dxa" w:w="3120"/>
+          </w:tcPr>
+          <w:p>
+            <w:pPr>
+              <w:spacing w:line="288" w:lineRule="auto"/>
+            </w:pPr>
+            <w:r>
+              <w:rPr>
+                <w:rFonts w:ascii="微软雅黑" w:hAnsi="微软雅黑" w:eastAsia="微软雅黑"/>
+                <w:b w:val="0"/>
+                <w:sz w:val="20"/>
+              </w:rPr>
+              <w:t>dtlms_runtime_operation_logs</w:t>
+            </w:r>
+          </w:p>
+        </w:tc>
+        <w:tc>
+          <w:tcPr>
+            <w:tcW w:type="dxa" w:w="3120"/>
+          </w:tcPr>
+          <w:p>
+            <w:pPr>
+              <w:spacing w:line="288" w:lineRule="auto"/>
+            </w:pPr>
+            <w:r>
+              <w:rPr>
+                <w:rFonts w:ascii="微软雅黑" w:hAnsi="微软雅黑" w:eastAsia="微软雅黑"/>
+                <w:b w:val="0"/>
+                <w:sz w:val="20"/>
+              </w:rPr>
+              <w:t>运行态操作日志镜像表</w:t>
+            </w:r>
+          </w:p>
+        </w:tc>
+        <w:tc>
+          <w:tcPr>
+            <w:tcW w:type="dxa" w:w="3120"/>
+          </w:tcPr>
+          <w:p>
+            <w:pPr>
+              <w:spacing w:line="288" w:lineRule="auto"/>
+            </w:pPr>
+            <w:r>
+              <w:rPr>
+                <w:rFonts w:ascii="微软雅黑" w:hAnsi="微软雅黑" w:eastAsia="微软雅黑"/>
+                <w:b w:val="0"/>
+                <w:sz w:val="20"/>
+              </w:rPr>
+              <w:t>id, payload</w:t>
+            </w:r>
+          </w:p>
+        </w:tc>
+      </w:tr>
+      <w:tr>
+        <w:tc>
+          <w:tcPr>
+            <w:tcW w:type="dxa" w:w="3120"/>
+          </w:tcPr>
+          <w:p>
+            <w:pPr>
+              <w:spacing w:line="288" w:lineRule="auto"/>
+            </w:pPr>
+            <w:r>
+              <w:rPr>
+                <w:rFonts w:ascii="微软雅黑" w:hAnsi="微软雅黑" w:eastAsia="微软雅黑"/>
+                <w:b w:val="0"/>
+                <w:sz w:val="20"/>
+              </w:rPr>
+              <w:t>dtlms_runtime_sync_logs</w:t>
+            </w:r>
+          </w:p>
+        </w:tc>
+        <w:tc>
+          <w:tcPr>
+            <w:tcW w:type="dxa" w:w="3120"/>
+          </w:tcPr>
+          <w:p>
+            <w:pPr>
+              <w:spacing w:line="288" w:lineRule="auto"/>
+            </w:pPr>
+            <w:r>
+              <w:rPr>
+                <w:rFonts w:ascii="微软雅黑" w:hAnsi="微软雅黑" w:eastAsia="微软雅黑"/>
+                <w:b w:val="0"/>
+                <w:sz w:val="20"/>
+              </w:rPr>
+              <w:t>运行态同步日志镜像表</w:t>
+            </w:r>
+          </w:p>
+        </w:tc>
+        <w:tc>
+          <w:tcPr>
+            <w:tcW w:type="dxa" w:w="3120"/>
+          </w:tcPr>
+          <w:p>
+            <w:pPr>
+              <w:spacing w:line="288" w:lineRule="auto"/>
+            </w:pPr>
+            <w:r>
+              <w:rPr>
+                <w:rFonts w:ascii="微软雅黑" w:hAnsi="微软雅黑" w:eastAsia="微软雅黑"/>
+                <w:b w:val="0"/>
+                <w:sz w:val="20"/>
+              </w:rPr>
+              <w:t>id, payload</w:t>
+            </w:r>
+          </w:p>
+        </w:tc>
+      </w:tr>
+      <w:tr>
+        <w:tc>
+          <w:tcPr>
+            <w:tcW w:type="dxa" w:w="3120"/>
+          </w:tcPr>
+          <w:p>
+            <w:pPr>
+              <w:spacing w:line="288" w:lineRule="auto"/>
+            </w:pPr>
+            <w:r>
+              <w:rPr>
+                <w:rFonts w:ascii="微软雅黑" w:hAnsi="微软雅黑" w:eastAsia="微软雅黑"/>
+                <w:b w:val="0"/>
+                <w:sz w:val="20"/>
+              </w:rPr>
+              <w:t>dtlms_runtime_workflow_tasks</w:t>
+            </w:r>
+          </w:p>
+        </w:tc>
+        <w:tc>
+          <w:tcPr>
+            <w:tcW w:type="dxa" w:w="3120"/>
+          </w:tcPr>
+          <w:p>
+            <w:pPr>
+              <w:spacing w:line="288" w:lineRule="auto"/>
+            </w:pPr>
+            <w:r>
+              <w:rPr>
+                <w:rFonts w:ascii="微软雅黑" w:hAnsi="微软雅黑" w:eastAsia="微软雅黑"/>
+                <w:b w:val="0"/>
+                <w:sz w:val="20"/>
+              </w:rPr>
+              <w:t>运行态流程任务镜像表</w:t>
+            </w:r>
+          </w:p>
+        </w:tc>
+        <w:tc>
+          <w:tcPr>
+            <w:tcW w:type="dxa" w:w="3120"/>
+          </w:tcPr>
+          <w:p>
+            <w:pPr>
+              <w:spacing w:line="288" w:lineRule="auto"/>
+            </w:pPr>
+            <w:r>
+              <w:rPr>
+                <w:rFonts w:ascii="微软雅黑" w:hAnsi="微软雅黑" w:eastAsia="微软雅黑"/>
+                <w:b w:val="0"/>
+                <w:sz w:val="20"/>
+              </w:rPr>
+              <w:t>id, payload</w:t>
+            </w:r>
+          </w:p>
+        </w:tc>
+      </w:tr>
+    </w:tbl>
+    <w:p>
+      <w:pPr>
+        <w:pStyle w:val="Heading3"/>
+        <w:spacing w:line="288" w:lineRule="auto"/>
+      </w:pPr>
+      <w:r>
+        <w:rPr>
+          <w:rFonts w:ascii="微软雅黑" w:hAnsi="微软雅黑" w:eastAsia="微软雅黑"/>
           <w:b/>
           <w:sz w:val="24"/>
         </w:rPr>
@@ -3474,7 +5172,7 @@
             </w:pPr>
             <w:r>
               <w:rPr>
-                <w:rFonts w:ascii="Calibri" w:hAnsi="Calibri" w:eastAsia="微软雅黑"/>
+                <w:rFonts w:ascii="微软雅黑" w:hAnsi="微软雅黑" w:eastAsia="微软雅黑"/>
                 <w:b w:val="0"/>
                 <w:sz w:val="20"/>
               </w:rPr>
@@ -3492,7 +5190,7 @@
             </w:pPr>
             <w:r>
               <w:rPr>
-                <w:rFonts w:ascii="Calibri" w:hAnsi="Calibri" w:eastAsia="微软雅黑"/>
+                <w:rFonts w:ascii="微软雅黑" w:hAnsi="微软雅黑" w:eastAsia="微软雅黑"/>
                 <w:b w:val="0"/>
                 <w:sz w:val="20"/>
               </w:rPr>
@@ -3512,7 +5210,121 @@
             </w:pPr>
             <w:r>
               <w:rPr>
-                <w:rFonts w:ascii="Calibri" w:hAnsi="Calibri" w:eastAsia="微软雅黑"/>
+                <w:rFonts w:ascii="微软雅黑" w:hAnsi="微软雅黑" w:eastAsia="微软雅黑"/>
+                <w:b w:val="0"/>
+                <w:sz w:val="20"/>
+              </w:rPr>
+              <w:t>字典类型 -&gt; 字典数据</w:t>
+            </w:r>
+          </w:p>
+        </w:tc>
+        <w:tc>
+          <w:tcPr>
+            <w:tcW w:type="dxa" w:w="4680"/>
+          </w:tcPr>
+          <w:p>
+            <w:pPr>
+              <w:spacing w:line="288" w:lineRule="auto"/>
+            </w:pPr>
+            <w:r>
+              <w:rPr>
+                <w:rFonts w:ascii="微软雅黑" w:hAnsi="微软雅黑" w:eastAsia="微软雅黑"/>
+                <w:b w:val="0"/>
+                <w:sz w:val="20"/>
+              </w:rPr>
+              <w:t>一对多关系，所有稳定枚举值、状态值和颜色值统一通过字典表治理。</w:t>
+            </w:r>
+          </w:p>
+        </w:tc>
+      </w:tr>
+      <w:tr>
+        <w:tc>
+          <w:tcPr>
+            <w:tcW w:type="dxa" w:w="4680"/>
+          </w:tcPr>
+          <w:p>
+            <w:pPr>
+              <w:spacing w:line="288" w:lineRule="auto"/>
+            </w:pPr>
+            <w:r>
+              <w:rPr>
+                <w:rFonts w:ascii="微软雅黑" w:hAnsi="微软雅黑" w:eastAsia="微软雅黑"/>
+                <w:b w:val="0"/>
+                <w:sz w:val="20"/>
+              </w:rPr>
+              <w:t>团队 -&gt; 导师</w:t>
+            </w:r>
+          </w:p>
+        </w:tc>
+        <w:tc>
+          <w:tcPr>
+            <w:tcW w:type="dxa" w:w="4680"/>
+          </w:tcPr>
+          <w:p>
+            <w:pPr>
+              <w:spacing w:line="288" w:lineRule="auto"/>
+            </w:pPr>
+            <w:r>
+              <w:rPr>
+                <w:rFonts w:ascii="微软雅黑" w:hAnsi="微软雅黑" w:eastAsia="微软雅黑"/>
+                <w:b w:val="0"/>
+                <w:sz w:val="20"/>
+              </w:rPr>
+              <w:t>多对多治理关系，lead_advisor_id 标识负责人导师，团队成员通过映射表维护。</w:t>
+            </w:r>
+          </w:p>
+        </w:tc>
+      </w:tr>
+      <w:tr>
+        <w:tc>
+          <w:tcPr>
+            <w:tcW w:type="dxa" w:w="4680"/>
+          </w:tcPr>
+          <w:p>
+            <w:pPr>
+              <w:spacing w:line="288" w:lineRule="auto"/>
+            </w:pPr>
+            <w:r>
+              <w:rPr>
+                <w:rFonts w:ascii="微软雅黑" w:hAnsi="微软雅黑" w:eastAsia="微软雅黑"/>
+                <w:b w:val="0"/>
+                <w:sz w:val="20"/>
+              </w:rPr>
+              <w:t>团队 -&gt; 学生</w:t>
+            </w:r>
+          </w:p>
+        </w:tc>
+        <w:tc>
+          <w:tcPr>
+            <w:tcW w:type="dxa" w:w="4680"/>
+          </w:tcPr>
+          <w:p>
+            <w:pPr>
+              <w:spacing w:line="288" w:lineRule="auto"/>
+            </w:pPr>
+            <w:r>
+              <w:rPr>
+                <w:rFonts w:ascii="微软雅黑" w:hAnsi="微软雅黑" w:eastAsia="微软雅黑"/>
+                <w:b w:val="0"/>
+                <w:sz w:val="20"/>
+              </w:rPr>
+              <w:t>一对多归属关系，当前归属通过 students.team_id 表达，变更过程进入历史表。</w:t>
+            </w:r>
+          </w:p>
+        </w:tc>
+      </w:tr>
+      <w:tr>
+        <w:tc>
+          <w:tcPr>
+            <w:tcW w:type="dxa" w:w="4680"/>
+          </w:tcPr>
+          <w:p>
+            <w:pPr>
+              <w:spacing w:line="288" w:lineRule="auto"/>
+            </w:pPr>
+            <w:r>
+              <w:rPr>
+                <w:rFonts w:ascii="微软雅黑" w:hAnsi="微软雅黑" w:eastAsia="微软雅黑"/>
                 <w:b w:val="0"/>
                 <w:sz w:val="20"/>
               </w:rPr>
@@ -3530,7 +5342,7 @@
             </w:pPr>
             <w:r>
               <w:rPr>
-                <w:rFonts w:ascii="Calibri" w:hAnsi="Calibri" w:eastAsia="微软雅黑"/>
+                <w:rFonts w:ascii="微软雅黑" w:hAnsi="微软雅黑" w:eastAsia="微软雅黑"/>
                 <w:b w:val="0"/>
                 <w:sz w:val="20"/>
               </w:rPr>
@@ -3550,7 +5362,7 @@
             </w:pPr>
             <w:r>
               <w:rPr>
-                <w:rFonts w:ascii="Calibri" w:hAnsi="Calibri" w:eastAsia="微软雅黑"/>
+                <w:rFonts w:ascii="微软雅黑" w:hAnsi="微软雅黑" w:eastAsia="微软雅黑"/>
                 <w:b w:val="0"/>
                 <w:sz w:val="20"/>
               </w:rPr>
@@ -3568,7 +5380,7 @@
             </w:pPr>
             <w:r>
               <w:rPr>
-                <w:rFonts w:ascii="Calibri" w:hAnsi="Calibri" w:eastAsia="微软雅黑"/>
+                <w:rFonts w:ascii="微软雅黑" w:hAnsi="微软雅黑" w:eastAsia="微软雅黑"/>
                 <w:b w:val="0"/>
                 <w:sz w:val="20"/>
               </w:rPr>
@@ -3588,7 +5400,7 @@
             </w:pPr>
             <w:r>
               <w:rPr>
-                <w:rFonts w:ascii="Calibri" w:hAnsi="Calibri" w:eastAsia="微软雅黑"/>
+                <w:rFonts w:ascii="微软雅黑" w:hAnsi="微软雅黑" w:eastAsia="微软雅黑"/>
                 <w:b w:val="0"/>
                 <w:sz w:val="20"/>
               </w:rPr>
@@ -3606,7 +5418,7 @@
             </w:pPr>
             <w:r>
               <w:rPr>
-                <w:rFonts w:ascii="Calibri" w:hAnsi="Calibri" w:eastAsia="微软雅黑"/>
+                <w:rFonts w:ascii="微软雅黑" w:hAnsi="微软雅黑" w:eastAsia="微软雅黑"/>
                 <w:b w:val="0"/>
                 <w:sz w:val="20"/>
               </w:rPr>
@@ -3626,7 +5438,7 @@
             </w:pPr>
             <w:r>
               <w:rPr>
-                <w:rFonts w:ascii="Calibri" w:hAnsi="Calibri" w:eastAsia="微软雅黑"/>
+                <w:rFonts w:ascii="微软雅黑" w:hAnsi="微软雅黑" w:eastAsia="微软雅黑"/>
                 <w:b w:val="0"/>
                 <w:sz w:val="20"/>
               </w:rPr>
@@ -3644,7 +5456,7 @@
             </w:pPr>
             <w:r>
               <w:rPr>
-                <w:rFonts w:ascii="Calibri" w:hAnsi="Calibri" w:eastAsia="微软雅黑"/>
+                <w:rFonts w:ascii="微软雅黑" w:hAnsi="微软雅黑" w:eastAsia="微软雅黑"/>
                 <w:b w:val="0"/>
                 <w:sz w:val="20"/>
               </w:rPr>
@@ -3664,7 +5476,7 @@
             </w:pPr>
             <w:r>
               <w:rPr>
-                <w:rFonts w:ascii="Calibri" w:hAnsi="Calibri" w:eastAsia="微软雅黑"/>
+                <w:rFonts w:ascii="微软雅黑" w:hAnsi="微软雅黑" w:eastAsia="微软雅黑"/>
                 <w:b w:val="0"/>
                 <w:sz w:val="20"/>
               </w:rPr>
@@ -3682,7 +5494,7 @@
             </w:pPr>
             <w:r>
               <w:rPr>
-                <w:rFonts w:ascii="Calibri" w:hAnsi="Calibri" w:eastAsia="微软雅黑"/>
+                <w:rFonts w:ascii="微软雅黑" w:hAnsi="微软雅黑" w:eastAsia="微软雅黑"/>
                 <w:b w:val="0"/>
                 <w:sz w:val="20"/>
               </w:rPr>
@@ -3702,7 +5514,7 @@
             </w:pPr>
             <w:r>
               <w:rPr>
-                <w:rFonts w:ascii="Calibri" w:hAnsi="Calibri" w:eastAsia="微软雅黑"/>
+                <w:rFonts w:ascii="微软雅黑" w:hAnsi="微软雅黑" w:eastAsia="微软雅黑"/>
                 <w:b w:val="0"/>
                 <w:sz w:val="20"/>
               </w:rPr>
@@ -3720,7 +5532,7 @@
             </w:pPr>
             <w:r>
               <w:rPr>
-                <w:rFonts w:ascii="Calibri" w:hAnsi="Calibri" w:eastAsia="微软雅黑"/>
+                <w:rFonts w:ascii="微软雅黑" w:hAnsi="微软雅黑" w:eastAsia="微软雅黑"/>
                 <w:b w:val="0"/>
                 <w:sz w:val="20"/>
               </w:rPr>
@@ -3740,7 +5552,7 @@
             </w:pPr>
             <w:r>
               <w:rPr>
-                <w:rFonts w:ascii="Calibri" w:hAnsi="Calibri" w:eastAsia="微软雅黑"/>
+                <w:rFonts w:ascii="微软雅黑" w:hAnsi="微软雅黑" w:eastAsia="微软雅黑"/>
                 <w:b w:val="0"/>
                 <w:sz w:val="20"/>
               </w:rPr>
@@ -3758,7 +5570,7 @@
             </w:pPr>
             <w:r>
               <w:rPr>
-                <w:rFonts w:ascii="Calibri" w:hAnsi="Calibri" w:eastAsia="微软雅黑"/>
+                <w:rFonts w:ascii="微软雅黑" w:hAnsi="微软雅黑" w:eastAsia="微软雅黑"/>
                 <w:b w:val="0"/>
                 <w:sz w:val="20"/>
               </w:rPr>
@@ -3778,7 +5590,7 @@
             </w:pPr>
             <w:r>
               <w:rPr>
-                <w:rFonts w:ascii="Calibri" w:hAnsi="Calibri" w:eastAsia="微软雅黑"/>
+                <w:rFonts w:ascii="微软雅黑" w:hAnsi="微软雅黑" w:eastAsia="微软雅黑"/>
                 <w:b w:val="0"/>
                 <w:sz w:val="20"/>
               </w:rPr>
@@ -3796,7 +5608,7 @@
             </w:pPr>
             <w:r>
               <w:rPr>
-                <w:rFonts w:ascii="Calibri" w:hAnsi="Calibri" w:eastAsia="微软雅黑"/>
+                <w:rFonts w:ascii="微软雅黑" w:hAnsi="微软雅黑" w:eastAsia="微软雅黑"/>
                 <w:b w:val="0"/>
                 <w:sz w:val="20"/>
               </w:rPr>
@@ -3813,7 +5625,7 @@
       </w:pPr>
       <w:r>
         <w:rPr>
-          <w:rFonts w:ascii="Calibri" w:hAnsi="Calibri" w:eastAsia="微软雅黑"/>
+          <w:rFonts w:ascii="微软雅黑" w:hAnsi="微软雅黑" w:eastAsia="微软雅黑"/>
           <w:b/>
           <w:sz w:val="24"/>
         </w:rPr>
@@ -3842,7 +5654,7 @@
             </w:pPr>
             <w:r>
               <w:rPr>
-                <w:rFonts w:ascii="Calibri" w:hAnsi="Calibri" w:eastAsia="微软雅黑"/>
+                <w:rFonts w:ascii="微软雅黑" w:hAnsi="微软雅黑" w:eastAsia="微软雅黑"/>
                 <w:b w:val="0"/>
                 <w:sz w:val="20"/>
               </w:rPr>
@@ -3860,7 +5672,7 @@
             </w:pPr>
             <w:r>
               <w:rPr>
-                <w:rFonts w:ascii="Calibri" w:hAnsi="Calibri" w:eastAsia="微软雅黑"/>
+                <w:rFonts w:ascii="微软雅黑" w:hAnsi="微软雅黑" w:eastAsia="微软雅黑"/>
                 <w:b w:val="0"/>
                 <w:sz w:val="20"/>
               </w:rPr>
@@ -3878,7 +5690,7 @@
             </w:pPr>
             <w:r>
               <w:rPr>
-                <w:rFonts w:ascii="Calibri" w:hAnsi="Calibri" w:eastAsia="微软雅黑"/>
+                <w:rFonts w:ascii="微软雅黑" w:hAnsi="微软雅黑" w:eastAsia="微软雅黑"/>
                 <w:b w:val="0"/>
                 <w:sz w:val="20"/>
               </w:rPr>
@@ -3898,7 +5710,7 @@
             </w:pPr>
             <w:r>
               <w:rPr>
-                <w:rFonts w:ascii="Calibri" w:hAnsi="Calibri" w:eastAsia="微软雅黑"/>
+                <w:rFonts w:ascii="微软雅黑" w:hAnsi="微软雅黑" w:eastAsia="微软雅黑"/>
                 <w:b w:val="0"/>
                 <w:sz w:val="20"/>
               </w:rPr>
@@ -3916,7 +5728,7 @@
             </w:pPr>
             <w:r>
               <w:rPr>
-                <w:rFonts w:ascii="Calibri" w:hAnsi="Calibri" w:eastAsia="微软雅黑"/>
+                <w:rFonts w:ascii="微软雅黑" w:hAnsi="微软雅黑" w:eastAsia="微软雅黑"/>
                 <w:b w:val="0"/>
                 <w:sz w:val="20"/>
               </w:rPr>
@@ -3934,7 +5746,7 @@
             </w:pPr>
             <w:r>
               <w:rPr>
-                <w:rFonts w:ascii="Calibri" w:hAnsi="Calibri" w:eastAsia="微软雅黑"/>
+                <w:rFonts w:ascii="微软雅黑" w:hAnsi="微软雅黑" w:eastAsia="微软雅黑"/>
                 <w:b w:val="0"/>
                 <w:sz w:val="20"/>
               </w:rPr>
@@ -3954,7 +5766,7 @@
             </w:pPr>
             <w:r>
               <w:rPr>
-                <w:rFonts w:ascii="Calibri" w:hAnsi="Calibri" w:eastAsia="微软雅黑"/>
+                <w:rFonts w:ascii="微软雅黑" w:hAnsi="微软雅黑" w:eastAsia="微软雅黑"/>
                 <w:b w:val="0"/>
                 <w:sz w:val="20"/>
               </w:rPr>
@@ -3972,7 +5784,7 @@
             </w:pPr>
             <w:r>
               <w:rPr>
-                <w:rFonts w:ascii="Calibri" w:hAnsi="Calibri" w:eastAsia="微软雅黑"/>
+                <w:rFonts w:ascii="微软雅黑" w:hAnsi="微软雅黑" w:eastAsia="微软雅黑"/>
                 <w:b w:val="0"/>
                 <w:sz w:val="20"/>
               </w:rPr>
@@ -3990,7 +5802,7 @@
             </w:pPr>
             <w:r>
               <w:rPr>
-                <w:rFonts w:ascii="Calibri" w:hAnsi="Calibri" w:eastAsia="微软雅黑"/>
+                <w:rFonts w:ascii="微软雅黑" w:hAnsi="微软雅黑" w:eastAsia="微软雅黑"/>
                 <w:b w:val="0"/>
                 <w:sz w:val="20"/>
               </w:rPr>
@@ -4010,7 +5822,7 @@
             </w:pPr>
             <w:r>
               <w:rPr>
-                <w:rFonts w:ascii="Calibri" w:hAnsi="Calibri" w:eastAsia="微软雅黑"/>
+                <w:rFonts w:ascii="微软雅黑" w:hAnsi="微软雅黑" w:eastAsia="微软雅黑"/>
                 <w:b w:val="0"/>
                 <w:sz w:val="20"/>
               </w:rPr>
@@ -4028,7 +5840,7 @@
             </w:pPr>
             <w:r>
               <w:rPr>
-                <w:rFonts w:ascii="Calibri" w:hAnsi="Calibri" w:eastAsia="微软雅黑"/>
+                <w:rFonts w:ascii="微软雅黑" w:hAnsi="微软雅黑" w:eastAsia="微软雅黑"/>
                 <w:b w:val="0"/>
                 <w:sz w:val="20"/>
               </w:rPr>
@@ -4046,7 +5858,7 @@
             </w:pPr>
             <w:r>
               <w:rPr>
-                <w:rFonts w:ascii="Calibri" w:hAnsi="Calibri" w:eastAsia="微软雅黑"/>
+                <w:rFonts w:ascii="微软雅黑" w:hAnsi="微软雅黑" w:eastAsia="微软雅黑"/>
                 <w:b w:val="0"/>
                 <w:sz w:val="20"/>
               </w:rPr>
@@ -4066,7 +5878,7 @@
             </w:pPr>
             <w:r>
               <w:rPr>
-                <w:rFonts w:ascii="Calibri" w:hAnsi="Calibri" w:eastAsia="微软雅黑"/>
+                <w:rFonts w:ascii="微软雅黑" w:hAnsi="微软雅黑" w:eastAsia="微软雅黑"/>
                 <w:b w:val="0"/>
                 <w:sz w:val="20"/>
               </w:rPr>
@@ -4084,7 +5896,7 @@
             </w:pPr>
             <w:r>
               <w:rPr>
-                <w:rFonts w:ascii="Calibri" w:hAnsi="Calibri" w:eastAsia="微软雅黑"/>
+                <w:rFonts w:ascii="微软雅黑" w:hAnsi="微软雅黑" w:eastAsia="微软雅黑"/>
                 <w:b w:val="0"/>
                 <w:sz w:val="20"/>
               </w:rPr>
@@ -4102,7 +5914,7 @@
             </w:pPr>
             <w:r>
               <w:rPr>
-                <w:rFonts w:ascii="Calibri" w:hAnsi="Calibri" w:eastAsia="微软雅黑"/>
+                <w:rFonts w:ascii="微软雅黑" w:hAnsi="微软雅黑" w:eastAsia="微软雅黑"/>
                 <w:b w:val="0"/>
                 <w:sz w:val="20"/>
               </w:rPr>
@@ -4119,7 +5931,7 @@
       </w:pPr>
       <w:r>
         <w:rPr>
-          <w:rFonts w:ascii="Calibri" w:hAnsi="Calibri" w:eastAsia="微软雅黑"/>
+          <w:rFonts w:ascii="微软雅黑" w:hAnsi="微软雅黑" w:eastAsia="微软雅黑"/>
           <w:b/>
           <w:sz w:val="32"/>
         </w:rPr>
@@ -4132,7 +5944,7 @@
       </w:pPr>
       <w:r>
         <w:rPr>
-          <w:rFonts w:ascii="Calibri" w:hAnsi="Calibri" w:eastAsia="微软雅黑"/>
+          <w:rFonts w:ascii="微软雅黑" w:hAnsi="微软雅黑" w:eastAsia="微软雅黑"/>
           <w:b w:val="0"/>
           <w:sz w:val="24"/>
         </w:rPr>
@@ -4146,7 +5958,7 @@
       </w:pPr>
       <w:r>
         <w:rPr>
-          <w:rFonts w:ascii="Calibri" w:hAnsi="Calibri" w:eastAsia="微软雅黑"/>
+          <w:rFonts w:ascii="微软雅黑" w:hAnsi="微软雅黑" w:eastAsia="微软雅黑"/>
           <w:b/>
           <w:sz w:val="24"/>
         </w:rPr>
@@ -4175,7 +5987,7 @@
             </w:pPr>
             <w:r>
               <w:rPr>
-                <w:rFonts w:ascii="Calibri" w:hAnsi="Calibri" w:eastAsia="微软雅黑"/>
+                <w:rFonts w:ascii="微软雅黑" w:hAnsi="微软雅黑" w:eastAsia="微软雅黑"/>
                 <w:b w:val="0"/>
                 <w:sz w:val="20"/>
               </w:rPr>
@@ -4193,7 +6005,7 @@
             </w:pPr>
             <w:r>
               <w:rPr>
-                <w:rFonts w:ascii="Calibri" w:hAnsi="Calibri" w:eastAsia="微软雅黑"/>
+                <w:rFonts w:ascii="微软雅黑" w:hAnsi="微软雅黑" w:eastAsia="微软雅黑"/>
                 <w:b w:val="0"/>
                 <w:sz w:val="20"/>
               </w:rPr>
@@ -4211,7 +6023,7 @@
             </w:pPr>
             <w:r>
               <w:rPr>
-                <w:rFonts w:ascii="Calibri" w:hAnsi="Calibri" w:eastAsia="微软雅黑"/>
+                <w:rFonts w:ascii="微软雅黑" w:hAnsi="微软雅黑" w:eastAsia="微软雅黑"/>
                 <w:b w:val="0"/>
                 <w:sz w:val="20"/>
               </w:rPr>
@@ -4231,7 +6043,7 @@
             </w:pPr>
             <w:r>
               <w:rPr>
-                <w:rFonts w:ascii="Calibri" w:hAnsi="Calibri" w:eastAsia="微软雅黑"/>
+                <w:rFonts w:ascii="微软雅黑" w:hAnsi="微软雅黑" w:eastAsia="微软雅黑"/>
                 <w:b w:val="0"/>
                 <w:sz w:val="20"/>
               </w:rPr>
@@ -4249,7 +6061,7 @@
             </w:pPr>
             <w:r>
               <w:rPr>
-                <w:rFonts w:ascii="Calibri" w:hAnsi="Calibri" w:eastAsia="微软雅黑"/>
+                <w:rFonts w:ascii="微软雅黑" w:hAnsi="微软雅黑" w:eastAsia="微软雅黑"/>
                 <w:b w:val="0"/>
                 <w:sz w:val="20"/>
               </w:rPr>
@@ -4267,7 +6079,7 @@
             </w:pPr>
             <w:r>
               <w:rPr>
-                <w:rFonts w:ascii="Calibri" w:hAnsi="Calibri" w:eastAsia="微软雅黑"/>
+                <w:rFonts w:ascii="微软雅黑" w:hAnsi="微软雅黑" w:eastAsia="微软雅黑"/>
                 <w:b w:val="0"/>
                 <w:sz w:val="20"/>
               </w:rPr>
@@ -4287,7 +6099,7 @@
             </w:pPr>
             <w:r>
               <w:rPr>
-                <w:rFonts w:ascii="Calibri" w:hAnsi="Calibri" w:eastAsia="微软雅黑"/>
+                <w:rFonts w:ascii="微软雅黑" w:hAnsi="微软雅黑" w:eastAsia="微软雅黑"/>
                 <w:b w:val="0"/>
                 <w:sz w:val="20"/>
               </w:rPr>
@@ -4305,7 +6117,7 @@
             </w:pPr>
             <w:r>
               <w:rPr>
-                <w:rFonts w:ascii="Calibri" w:hAnsi="Calibri" w:eastAsia="微软雅黑"/>
+                <w:rFonts w:ascii="微软雅黑" w:hAnsi="微软雅黑" w:eastAsia="微软雅黑"/>
                 <w:b w:val="0"/>
                 <w:sz w:val="20"/>
               </w:rPr>
@@ -4323,7 +6135,7 @@
             </w:pPr>
             <w:r>
               <w:rPr>
-                <w:rFonts w:ascii="Calibri" w:hAnsi="Calibri" w:eastAsia="微软雅黑"/>
+                <w:rFonts w:ascii="微软雅黑" w:hAnsi="微软雅黑" w:eastAsia="微软雅黑"/>
                 <w:b w:val="0"/>
                 <w:sz w:val="20"/>
               </w:rPr>
@@ -4343,7 +6155,7 @@
             </w:pPr>
             <w:r>
               <w:rPr>
-                <w:rFonts w:ascii="Calibri" w:hAnsi="Calibri" w:eastAsia="微软雅黑"/>
+                <w:rFonts w:ascii="微软雅黑" w:hAnsi="微软雅黑" w:eastAsia="微软雅黑"/>
                 <w:b w:val="0"/>
                 <w:sz w:val="20"/>
               </w:rPr>
@@ -4361,7 +6173,7 @@
             </w:pPr>
             <w:r>
               <w:rPr>
-                <w:rFonts w:ascii="Calibri" w:hAnsi="Calibri" w:eastAsia="微软雅黑"/>
+                <w:rFonts w:ascii="微软雅黑" w:hAnsi="微软雅黑" w:eastAsia="微软雅黑"/>
                 <w:b w:val="0"/>
                 <w:sz w:val="20"/>
               </w:rPr>
@@ -4379,7 +6191,7 @@
             </w:pPr>
             <w:r>
               <w:rPr>
-                <w:rFonts w:ascii="Calibri" w:hAnsi="Calibri" w:eastAsia="微软雅黑"/>
+                <w:rFonts w:ascii="微软雅黑" w:hAnsi="微软雅黑" w:eastAsia="微软雅黑"/>
                 <w:b w:val="0"/>
                 <w:sz w:val="20"/>
               </w:rPr>
@@ -4399,7 +6211,7 @@
             </w:pPr>
             <w:r>
               <w:rPr>
-                <w:rFonts w:ascii="Calibri" w:hAnsi="Calibri" w:eastAsia="微软雅黑"/>
+                <w:rFonts w:ascii="微软雅黑" w:hAnsi="微软雅黑" w:eastAsia="微软雅黑"/>
                 <w:b w:val="0"/>
                 <w:sz w:val="20"/>
               </w:rPr>
@@ -4417,7 +6229,7 @@
             </w:pPr>
             <w:r>
               <w:rPr>
-                <w:rFonts w:ascii="Calibri" w:hAnsi="Calibri" w:eastAsia="微软雅黑"/>
+                <w:rFonts w:ascii="微软雅黑" w:hAnsi="微软雅黑" w:eastAsia="微软雅黑"/>
                 <w:b w:val="0"/>
                 <w:sz w:val="20"/>
               </w:rPr>
@@ -4435,7 +6247,7 @@
             </w:pPr>
             <w:r>
               <w:rPr>
-                <w:rFonts w:ascii="Calibri" w:hAnsi="Calibri" w:eastAsia="微软雅黑"/>
+                <w:rFonts w:ascii="微软雅黑" w:hAnsi="微软雅黑" w:eastAsia="微软雅黑"/>
                 <w:b w:val="0"/>
                 <w:sz w:val="20"/>
               </w:rPr>
@@ -4455,7 +6267,7 @@
             </w:pPr>
             <w:r>
               <w:rPr>
-                <w:rFonts w:ascii="Calibri" w:hAnsi="Calibri" w:eastAsia="微软雅黑"/>
+                <w:rFonts w:ascii="微软雅黑" w:hAnsi="微软雅黑" w:eastAsia="微软雅黑"/>
                 <w:b w:val="0"/>
                 <w:sz w:val="20"/>
               </w:rPr>
@@ -4473,7 +6285,7 @@
             </w:pPr>
             <w:r>
               <w:rPr>
-                <w:rFonts w:ascii="Calibri" w:hAnsi="Calibri" w:eastAsia="微软雅黑"/>
+                <w:rFonts w:ascii="微软雅黑" w:hAnsi="微软雅黑" w:eastAsia="微软雅黑"/>
                 <w:b w:val="0"/>
                 <w:sz w:val="20"/>
               </w:rPr>
@@ -4491,7 +6303,7 @@
             </w:pPr>
             <w:r>
               <w:rPr>
-                <w:rFonts w:ascii="Calibri" w:hAnsi="Calibri" w:eastAsia="微软雅黑"/>
+                <w:rFonts w:ascii="微软雅黑" w:hAnsi="微软雅黑" w:eastAsia="微软雅黑"/>
                 <w:b w:val="0"/>
                 <w:sz w:val="20"/>
               </w:rPr>
@@ -4508,7 +6320,7 @@
       </w:pPr>
       <w:r>
         <w:rPr>
-          <w:rFonts w:ascii="Calibri" w:hAnsi="Calibri" w:eastAsia="微软雅黑"/>
+          <w:rFonts w:ascii="微软雅黑" w:hAnsi="微软雅黑" w:eastAsia="微软雅黑"/>
           <w:b/>
           <w:sz w:val="32"/>
         </w:rPr>
@@ -4522,7 +6334,7 @@
       </w:pPr>
       <w:r>
         <w:rPr>
-          <w:rFonts w:ascii="Calibri" w:hAnsi="Calibri" w:eastAsia="微软雅黑"/>
+          <w:rFonts w:ascii="微软雅黑" w:hAnsi="微软雅黑" w:eastAsia="微软雅黑"/>
           <w:b/>
           <w:sz w:val="24"/>
         </w:rPr>
@@ -4550,7 +6362,7 @@
             </w:pPr>
             <w:r>
               <w:rPr>
-                <w:rFonts w:ascii="Calibri" w:hAnsi="Calibri" w:eastAsia="微软雅黑"/>
+                <w:rFonts w:ascii="微软雅黑" w:hAnsi="微软雅黑" w:eastAsia="微软雅黑"/>
                 <w:b w:val="0"/>
                 <w:sz w:val="20"/>
               </w:rPr>
@@ -4568,7 +6380,7 @@
             </w:pPr>
             <w:r>
               <w:rPr>
-                <w:rFonts w:ascii="Calibri" w:hAnsi="Calibri" w:eastAsia="微软雅黑"/>
+                <w:rFonts w:ascii="微软雅黑" w:hAnsi="微软雅黑" w:eastAsia="微软雅黑"/>
                 <w:b w:val="0"/>
                 <w:sz w:val="20"/>
               </w:rPr>
@@ -4588,7 +6400,7 @@
             </w:pPr>
             <w:r>
               <w:rPr>
-                <w:rFonts w:ascii="Calibri" w:hAnsi="Calibri" w:eastAsia="微软雅黑"/>
+                <w:rFonts w:ascii="微软雅黑" w:hAnsi="微软雅黑" w:eastAsia="微软雅黑"/>
                 <w:b w:val="0"/>
                 <w:sz w:val="20"/>
               </w:rPr>
@@ -4606,11 +6418,11 @@
             </w:pPr>
             <w:r>
               <w:rPr>
-                <w:rFonts w:ascii="Calibri" w:hAnsi="Calibri" w:eastAsia="微软雅黑"/>
+                <w:rFonts w:ascii="微软雅黑" w:hAnsi="微软雅黑" w:eastAsia="微软雅黑"/>
                 <w:b w:val="0"/>
                 <w:sz w:val="20"/>
               </w:rPr>
-              <w:t>JWT + RBAC + 刷新令牌，控制接口与页面访问。</w:t>
+              <w:t>JWT + RBAC + Redis Session，控制接口与页面访问，并支持登出后立即失效。</w:t>
             </w:r>
           </w:p>
         </w:tc>
@@ -4626,7 +6438,7 @@
             </w:pPr>
             <w:r>
               <w:rPr>
-                <w:rFonts w:ascii="Calibri" w:hAnsi="Calibri" w:eastAsia="微软雅黑"/>
+                <w:rFonts w:ascii="微软雅黑" w:hAnsi="微软雅黑" w:eastAsia="微软雅黑"/>
                 <w:b w:val="0"/>
                 <w:sz w:val="20"/>
               </w:rPr>
@@ -4644,7 +6456,7 @@
             </w:pPr>
             <w:r>
               <w:rPr>
-                <w:rFonts w:ascii="Calibri" w:hAnsi="Calibri" w:eastAsia="微软雅黑"/>
+                <w:rFonts w:ascii="微软雅黑" w:hAnsi="微软雅黑" w:eastAsia="微软雅黑"/>
                 <w:b w:val="0"/>
                 <w:sz w:val="20"/>
               </w:rPr>
@@ -4664,7 +6476,7 @@
             </w:pPr>
             <w:r>
               <w:rPr>
-                <w:rFonts w:ascii="Calibri" w:hAnsi="Calibri" w:eastAsia="微软雅黑"/>
+                <w:rFonts w:ascii="微软雅黑" w:hAnsi="微软雅黑" w:eastAsia="微软雅黑"/>
                 <w:b w:val="0"/>
                 <w:sz w:val="20"/>
               </w:rPr>
@@ -4682,7 +6494,7 @@
             </w:pPr>
             <w:r>
               <w:rPr>
-                <w:rFonts w:ascii="Calibri" w:hAnsi="Calibri" w:eastAsia="微软雅黑"/>
+                <w:rFonts w:ascii="微软雅黑" w:hAnsi="微软雅黑" w:eastAsia="微软雅黑"/>
                 <w:b w:val="0"/>
                 <w:sz w:val="20"/>
               </w:rPr>
@@ -4702,7 +6514,7 @@
             </w:pPr>
             <w:r>
               <w:rPr>
-                <w:rFonts w:ascii="Calibri" w:hAnsi="Calibri" w:eastAsia="微软雅黑"/>
+                <w:rFonts w:ascii="微软雅黑" w:hAnsi="微软雅黑" w:eastAsia="微软雅黑"/>
                 <w:b w:val="0"/>
                 <w:sz w:val="20"/>
               </w:rPr>
@@ -4720,11 +6532,11 @@
             </w:pPr>
             <w:r>
               <w:rPr>
-                <w:rFonts w:ascii="Calibri" w:hAnsi="Calibri" w:eastAsia="微软雅黑"/>
+                <w:rFonts w:ascii="微软雅黑" w:hAnsi="微软雅黑" w:eastAsia="微软雅黑"/>
                 <w:b w:val="0"/>
                 <w:sz w:val="20"/>
               </w:rPr>
-              <w:t>Redis Sentinel + CTDTLMS_ 统一前缀，支撑提醒和驾驶舱热点缓存。</w:t>
+              <w:t>Redis Sentinel + CTDTLMS_ 统一前缀，支撑登录会话、提醒状态与驾驶舱热点缓存。</w:t>
             </w:r>
           </w:p>
         </w:tc>
@@ -4740,7 +6552,7 @@
             </w:pPr>
             <w:r>
               <w:rPr>
-                <w:rFonts w:ascii="Calibri" w:hAnsi="Calibri" w:eastAsia="微软雅黑"/>
+                <w:rFonts w:ascii="微软雅黑" w:hAnsi="微软雅黑" w:eastAsia="微软雅黑"/>
                 <w:b w:val="0"/>
                 <w:sz w:val="20"/>
               </w:rPr>
@@ -4758,7 +6570,7 @@
             </w:pPr>
             <w:r>
               <w:rPr>
-                <w:rFonts w:ascii="Calibri" w:hAnsi="Calibri" w:eastAsia="微软雅黑"/>
+                <w:rFonts w:ascii="微软雅黑" w:hAnsi="微软雅黑" w:eastAsia="微软雅黑"/>
                 <w:b w:val="0"/>
                 <w:sz w:val="20"/>
               </w:rPr>
@@ -4775,7 +6587,7 @@
       </w:pPr>
       <w:r>
         <w:rPr>
-          <w:rFonts w:ascii="Calibri" w:hAnsi="Calibri" w:eastAsia="微软雅黑"/>
+          <w:rFonts w:ascii="微软雅黑" w:hAnsi="微软雅黑" w:eastAsia="微软雅黑"/>
           <w:b/>
           <w:sz w:val="32"/>
         </w:rPr>
@@ -4788,7 +6600,7 @@
       </w:pPr>
       <w:r>
         <w:rPr>
-          <w:rFonts w:ascii="Calibri" w:hAnsi="Calibri" w:eastAsia="微软雅黑"/>
+          <w:rFonts w:ascii="微软雅黑" w:hAnsi="微软雅黑" w:eastAsia="微软雅黑"/>
           <w:b w:val="0"/>
           <w:sz w:val="24"/>
         </w:rPr>
@@ -4838,7 +6650,7 @@
       </w:pPr>
       <w:r>
         <w:rPr>
-          <w:rFonts w:ascii="Calibri" w:hAnsi="Calibri" w:eastAsia="微软雅黑"/>
+          <w:rFonts w:ascii="微软雅黑" w:hAnsi="微软雅黑" w:eastAsia="微软雅黑"/>
           <w:b w:val="0"/>
           <w:sz w:val="20"/>
         </w:rPr>
@@ -4852,7 +6664,7 @@
       </w:pPr>
       <w:r>
         <w:rPr>
-          <w:rFonts w:ascii="Calibri" w:hAnsi="Calibri" w:eastAsia="微软雅黑"/>
+          <w:rFonts w:ascii="微软雅黑" w:hAnsi="微软雅黑" w:eastAsia="微软雅黑"/>
           <w:b/>
           <w:sz w:val="32"/>
         </w:rPr>
@@ -4866,7 +6678,7 @@
       </w:pPr>
       <w:r>
         <w:rPr>
-          <w:rFonts w:ascii="Calibri" w:hAnsi="Calibri" w:eastAsia="微软雅黑"/>
+          <w:rFonts w:ascii="微软雅黑" w:hAnsi="微软雅黑" w:eastAsia="微软雅黑"/>
           <w:b w:val="0"/>
           <w:sz w:val="24"/>
         </w:rPr>
@@ -4880,7 +6692,7 @@
       </w:pPr>
       <w:r>
         <w:rPr>
-          <w:rFonts w:ascii="Calibri" w:hAnsi="Calibri" w:eastAsia="微软雅黑"/>
+          <w:rFonts w:ascii="微软雅黑" w:hAnsi="微软雅黑" w:eastAsia="微软雅黑"/>
           <w:b w:val="0"/>
           <w:sz w:val="24"/>
         </w:rPr>
@@ -4894,7 +6706,35 @@
       </w:pPr>
       <w:r>
         <w:rPr>
-          <w:rFonts w:ascii="Calibri" w:hAnsi="Calibri" w:eastAsia="微软雅黑"/>
+          <w:rFonts w:ascii="微软雅黑" w:hAnsi="微软雅黑" w:eastAsia="微软雅黑"/>
+          <w:b w:val="0"/>
+          <w:sz w:val="24"/>
+        </w:rPr>
+        <w:t>字典类型与字典数据表已经纳入正式数据库设计，页面状态、选项与颜色均应优先由数据库字典驱动。</w:t>
+      </w:r>
+    </w:p>
+    <w:p>
+      <w:pPr>
+        <w:pStyle w:val="ListBullet"/>
+        <w:spacing w:line="288" w:lineRule="auto"/>
+      </w:pPr>
+      <w:r>
+        <w:rPr>
+          <w:rFonts w:ascii="微软雅黑" w:hAnsi="微软雅黑" w:eastAsia="微软雅黑"/>
+          <w:b w:val="0"/>
+          <w:sz w:val="24"/>
+        </w:rPr>
+        <w:t>运行态镜像表用于承载统一持久化结果，但系统运行期间仍以 PostgreSQL 为唯一事实来源。</w:t>
+      </w:r>
+    </w:p>
+    <w:p>
+      <w:pPr>
+        <w:pStyle w:val="ListBullet"/>
+        <w:spacing w:line="288" w:lineRule="auto"/>
+      </w:pPr>
+      <w:r>
+        <w:rPr>
+          <w:rFonts w:ascii="微软雅黑" w:hAnsi="微软雅黑" w:eastAsia="微软雅黑"/>
           <w:b w:val="0"/>
           <w:sz w:val="24"/>
         </w:rPr>
@@ -4908,7 +6748,7 @@
       </w:pPr>
       <w:r>
         <w:rPr>
-          <w:rFonts w:ascii="Calibri" w:hAnsi="Calibri" w:eastAsia="微软雅黑"/>
+          <w:rFonts w:ascii="微软雅黑" w:hAnsi="微软雅黑" w:eastAsia="微软雅黑"/>
           <w:b w:val="0"/>
           <w:sz w:val="24"/>
         </w:rPr>
@@ -5289,7 +7129,7 @@
     <w:qFormat/>
     <w:rsid w:val="00FC693F"/>
     <w:rPr>
-      <w:rFonts w:ascii="Calibri" w:hAnsi="Calibri" w:eastAsia="微软雅黑"/>
+      <w:rFonts w:ascii="微软雅黑" w:hAnsi="微软雅黑" w:eastAsia="微软雅黑"/>
       <w:sz w:val="24"/>
     </w:rPr>
   </w:style>
@@ -5352,7 +7192,7 @@
       <w:outlineLvl w:val="0"/>
     </w:pPr>
     <w:rPr>
-      <w:rFonts w:asciiTheme="majorHAnsi" w:eastAsiaTheme="majorEastAsia" w:hAnsiTheme="majorHAnsi" w:cstheme="majorBidi" w:ascii="Calibri" w:hAnsi="Calibri" w:eastAsia="微软雅黑"/>
+      <w:rFonts w:asciiTheme="majorHAnsi" w:eastAsiaTheme="majorEastAsia" w:hAnsiTheme="majorHAnsi" w:cstheme="majorBidi" w:ascii="微软雅黑" w:hAnsi="微软雅黑" w:eastAsia="微软雅黑"/>
       <w:b/>
       <w:bCs/>
       <w:color w:val="365F91" w:themeColor="accent1" w:themeShade="BF"/>
@@ -5376,7 +7216,7 @@
       <w:outlineLvl w:val="1"/>
     </w:pPr>
     <w:rPr>
-      <w:rFonts w:asciiTheme="majorHAnsi" w:eastAsiaTheme="majorEastAsia" w:hAnsiTheme="majorHAnsi" w:cstheme="majorBidi" w:ascii="Calibri" w:hAnsi="Calibri" w:eastAsia="微软雅黑"/>
+      <w:rFonts w:asciiTheme="majorHAnsi" w:eastAsiaTheme="majorEastAsia" w:hAnsiTheme="majorHAnsi" w:cstheme="majorBidi" w:ascii="微软雅黑" w:hAnsi="微软雅黑" w:eastAsia="微软雅黑"/>
       <w:b/>
       <w:bCs/>
       <w:color w:val="4F81BD" w:themeColor="accent1"/>
@@ -5400,7 +7240,7 @@
       <w:outlineLvl w:val="2"/>
     </w:pPr>
     <w:rPr>
-      <w:rFonts w:asciiTheme="majorHAnsi" w:eastAsiaTheme="majorEastAsia" w:hAnsiTheme="majorHAnsi" w:cstheme="majorBidi" w:ascii="Calibri" w:hAnsi="Calibri" w:eastAsia="微软雅黑"/>
+      <w:rFonts w:asciiTheme="majorHAnsi" w:eastAsiaTheme="majorEastAsia" w:hAnsiTheme="majorHAnsi" w:cstheme="majorBidi" w:ascii="微软雅黑" w:hAnsi="微软雅黑" w:eastAsia="微软雅黑"/>
       <w:b/>
       <w:bCs/>
       <w:color w:val="4F81BD" w:themeColor="accent1"/>

</xml_diff>